<commit_message>
Solo descomente el codigo de las validaciones erroneas
</commit_message>
<xml_diff>
--- a/docs/Workshop 2.docx
+++ b/docs/Workshop 2.docx
@@ -91,7 +91,6 @@
           <w:lang w:val="es-419"/>
         </w:rPr>
       </w:pPr>
-      <w:proofErr w:type="spellStart"/>
       <w:r>
         <w:rPr>
           <w:lang w:val="es-419"/>
@@ -102,14 +101,7 @@
         <w:rPr>
           <w:lang w:val="es-419"/>
         </w:rPr>
-        <w:t>_Spotify</w:t>
-      </w:r>
-      <w:proofErr w:type="spellEnd"/>
-      <w:r>
-        <w:rPr>
-          <w:lang w:val="es-419"/>
-        </w:rPr>
-        <w:t>:</w:t>
+        <w:t>_Spotify:</w:t>
       </w:r>
     </w:p>
     <w:p>
@@ -180,19 +172,11 @@
           <w:lang w:val="es-419"/>
         </w:rPr>
       </w:pPr>
-      <w:proofErr w:type="spellStart"/>
       <w:r>
         <w:rPr>
           <w:lang w:val="es-419"/>
         </w:rPr>
-        <w:t>Granularidad_grammy</w:t>
-      </w:r>
-      <w:proofErr w:type="spellEnd"/>
-      <w:r>
-        <w:rPr>
-          <w:lang w:val="es-419"/>
-        </w:rPr>
-        <w:t>:</w:t>
+        <w:t>Granularidad_grammy:</w:t>
       </w:r>
     </w:p>
     <w:p>
@@ -309,7 +293,6 @@
                 <w:lang w:val="es-419"/>
               </w:rPr>
             </w:pPr>
-            <w:proofErr w:type="spellStart"/>
             <w:r>
               <w:rPr>
                 <w:rFonts w:ascii="Times New Roman" w:eastAsia="Times New Roman" w:hAnsi="Times New Roman" w:cs="Times New Roman"/>
@@ -318,7 +301,6 @@
               </w:rPr>
               <w:t>Requirement</w:t>
             </w:r>
-            <w:proofErr w:type="spellEnd"/>
           </w:p>
         </w:tc>
         <w:tc>
@@ -340,23 +322,36 @@
                 <w:sz w:val="24"/>
                 <w:szCs w:val="24"/>
               </w:rPr>
-              <w:t xml:space="preserve">Business </w:t>
-            </w:r>
-            <w:proofErr w:type="spellStart"/>
+              <w:t>Business Question</w:t>
+            </w:r>
+          </w:p>
+        </w:tc>
+        <w:tc>
+          <w:tcPr>
+            <w:tcW w:w="1938" w:type="dxa"/>
+          </w:tcPr>
+          <w:p>
+            <w:pPr>
+              <w:jc w:val="both"/>
+              <w:rPr>
+                <w:sz w:val="24"/>
+                <w:szCs w:val="24"/>
+                <w:lang w:val="es-419"/>
+              </w:rPr>
+            </w:pPr>
             <w:r>
               <w:rPr>
                 <w:rFonts w:ascii="Times New Roman" w:eastAsia="Times New Roman" w:hAnsi="Times New Roman" w:cs="Times New Roman"/>
                 <w:sz w:val="24"/>
                 <w:szCs w:val="24"/>
               </w:rPr>
-              <w:t>Question</w:t>
-            </w:r>
-            <w:proofErr w:type="spellEnd"/>
-          </w:p>
-        </w:tc>
-        <w:tc>
-          <w:tcPr>
-            <w:tcW w:w="1938" w:type="dxa"/>
+              <w:t>Data Required</w:t>
+            </w:r>
+          </w:p>
+        </w:tc>
+        <w:tc>
+          <w:tcPr>
+            <w:tcW w:w="1982" w:type="dxa"/>
           </w:tcPr>
           <w:p>
             <w:pPr>
@@ -373,68 +368,7 @@
                 <w:sz w:val="24"/>
                 <w:szCs w:val="24"/>
               </w:rPr>
-              <w:t xml:space="preserve">Data </w:t>
-            </w:r>
-            <w:proofErr w:type="spellStart"/>
-            <w:r>
-              <w:rPr>
-                <w:rFonts w:ascii="Times New Roman" w:eastAsia="Times New Roman" w:hAnsi="Times New Roman" w:cs="Times New Roman"/>
-                <w:sz w:val="24"/>
-                <w:szCs w:val="24"/>
-              </w:rPr>
-              <w:t>Required</w:t>
-            </w:r>
-            <w:proofErr w:type="spellEnd"/>
-          </w:p>
-        </w:tc>
-        <w:tc>
-          <w:tcPr>
-            <w:tcW w:w="1982" w:type="dxa"/>
-          </w:tcPr>
-          <w:p>
-            <w:pPr>
-              <w:jc w:val="both"/>
-              <w:rPr>
-                <w:sz w:val="24"/>
-                <w:szCs w:val="24"/>
-                <w:lang w:val="es-419"/>
-              </w:rPr>
-            </w:pPr>
-            <w:proofErr w:type="spellStart"/>
-            <w:r>
-              <w:rPr>
-                <w:rFonts w:ascii="Times New Roman" w:eastAsia="Times New Roman" w:hAnsi="Times New Roman" w:cs="Times New Roman"/>
-                <w:sz w:val="24"/>
-                <w:szCs w:val="24"/>
-              </w:rPr>
-              <w:t>Expected</w:t>
-            </w:r>
-            <w:proofErr w:type="spellEnd"/>
-            <w:r>
-              <w:rPr>
-                <w:rFonts w:ascii="Times New Roman" w:eastAsia="Times New Roman" w:hAnsi="Times New Roman" w:cs="Times New Roman"/>
-                <w:sz w:val="24"/>
-                <w:szCs w:val="24"/>
-              </w:rPr>
-              <w:t xml:space="preserve"> </w:t>
-            </w:r>
-            <w:proofErr w:type="spellStart"/>
-            <w:r>
-              <w:rPr>
-                <w:rFonts w:ascii="Times New Roman" w:eastAsia="Times New Roman" w:hAnsi="Times New Roman" w:cs="Times New Roman"/>
-                <w:sz w:val="24"/>
-                <w:szCs w:val="24"/>
-              </w:rPr>
-              <w:t>Analytical</w:t>
-            </w:r>
-            <w:proofErr w:type="spellEnd"/>
-            <w:r>
-              <w:rPr>
-                <w:rFonts w:ascii="Times New Roman" w:eastAsia="Times New Roman" w:hAnsi="Times New Roman" w:cs="Times New Roman"/>
-                <w:sz w:val="24"/>
-                <w:szCs w:val="24"/>
-              </w:rPr>
-              <w:t xml:space="preserve"> Output</w:t>
+              <w:t>Expected Analytical Output</w:t>
             </w:r>
           </w:p>
         </w:tc>
@@ -696,47 +630,11 @@
                 <w:lang w:val="en-US"/>
               </w:rPr>
             </w:pPr>
-            <w:proofErr w:type="spellStart"/>
             <w:r>
               <w:rPr>
                 <w:lang w:val="en-US"/>
               </w:rPr>
-              <w:t>track_name</w:t>
-            </w:r>
-            <w:proofErr w:type="spellEnd"/>
-            <w:r>
-              <w:rPr>
-                <w:lang w:val="en-US"/>
-              </w:rPr>
-              <w:t xml:space="preserve">, </w:t>
-            </w:r>
-            <w:proofErr w:type="spellStart"/>
-            <w:r>
-              <w:rPr>
-                <w:lang w:val="en-US"/>
-              </w:rPr>
-              <w:t>track_artist</w:t>
-            </w:r>
-            <w:proofErr w:type="spellEnd"/>
-            <w:r>
-              <w:rPr>
-                <w:lang w:val="en-US"/>
-              </w:rPr>
-              <w:t xml:space="preserve">, explicit, energy, danceability, popularity, </w:t>
-            </w:r>
-            <w:proofErr w:type="spellStart"/>
-            <w:r>
-              <w:rPr>
-                <w:lang w:val="en-US"/>
-              </w:rPr>
-              <w:t>duration_ms</w:t>
-            </w:r>
-            <w:proofErr w:type="spellEnd"/>
-            <w:r>
-              <w:rPr>
-                <w:lang w:val="en-US"/>
-              </w:rPr>
-              <w:t>, category, nominee</w:t>
+              <w:t>track_name, track_artist, explicit, energy, danceability, popularity, duration_ms, category, nominee</w:t>
             </w:r>
           </w:p>
         </w:tc>
@@ -756,47 +654,7 @@
               <w:t>1. Perfil Sonoro Promedio:</w:t>
             </w:r>
             <w:r>
-              <w:t xml:space="preserve"> Gráfico de radar (o </w:t>
-            </w:r>
-            <w:proofErr w:type="spellStart"/>
-            <w:r>
-              <w:t>boxplots</w:t>
-            </w:r>
-            <w:proofErr w:type="spellEnd"/>
-            <w:r>
-              <w:t>) con la media y varianza de métricas de audio (</w:t>
-            </w:r>
-            <w:proofErr w:type="spellStart"/>
-            <w:r>
-              <w:t>energy</w:t>
-            </w:r>
-            <w:proofErr w:type="spellEnd"/>
-            <w:r>
-              <w:t xml:space="preserve">, </w:t>
-            </w:r>
-            <w:proofErr w:type="spellStart"/>
-            <w:r>
-              <w:t>loudness</w:t>
-            </w:r>
-            <w:proofErr w:type="spellEnd"/>
-            <w:r>
-              <w:t xml:space="preserve">, </w:t>
-            </w:r>
-            <w:proofErr w:type="spellStart"/>
-            <w:r>
-              <w:t>danceability</w:t>
-            </w:r>
-            <w:proofErr w:type="spellEnd"/>
-            <w:r>
-              <w:t xml:space="preserve">, </w:t>
-            </w:r>
-            <w:proofErr w:type="spellStart"/>
-            <w:r>
-              <w:t>duration_ms</w:t>
-            </w:r>
-            <w:proofErr w:type="spellEnd"/>
-            <w:r>
-              <w:t>) de temas premiados.</w:t>
+              <w:t xml:space="preserve"> Gráfico de radar (o boxplots) con la media y varianza de métricas de audio (energy, loudness, danceability, duration_ms) de temas premiados.</w:t>
             </w:r>
           </w:p>
           <w:p>
@@ -819,23 +677,7 @@
               <w:t>2. Análisis de Popularidad y Explicitud:</w:t>
             </w:r>
             <w:r>
-              <w:t xml:space="preserve"> Matriz de distribución de </w:t>
-            </w:r>
-            <w:proofErr w:type="spellStart"/>
-            <w:r>
-              <w:t>popularity</w:t>
-            </w:r>
-            <w:proofErr w:type="spellEnd"/>
-            <w:r>
-              <w:t xml:space="preserve"> y porcentaje de canciones </w:t>
-            </w:r>
-            <w:proofErr w:type="spellStart"/>
-            <w:r>
-              <w:t>explicit</w:t>
-            </w:r>
-            <w:proofErr w:type="spellEnd"/>
-            <w:r>
-              <w:t xml:space="preserve"> dentro de los ganadores.</w:t>
+              <w:t xml:space="preserve"> Matriz de distribución de popularity y porcentaje de canciones explicit dentro de los ganadores.</w:t>
             </w:r>
           </w:p>
           <w:p>
@@ -938,35 +780,7 @@
               <w:rPr>
                 <w:lang w:val="en-US"/>
               </w:rPr>
-              <w:t xml:space="preserve">nominee, </w:t>
-            </w:r>
-            <w:proofErr w:type="spellStart"/>
-            <w:r>
-              <w:rPr>
-                <w:lang w:val="en-US"/>
-              </w:rPr>
-              <w:t>track_artist</w:t>
-            </w:r>
-            <w:proofErr w:type="spellEnd"/>
-            <w:r>
-              <w:rPr>
-                <w:lang w:val="en-US"/>
-              </w:rPr>
-              <w:t xml:space="preserve">, </w:t>
-            </w:r>
-            <w:proofErr w:type="spellStart"/>
-            <w:r>
-              <w:rPr>
-                <w:lang w:val="en-US"/>
-              </w:rPr>
-              <w:t>track_genre</w:t>
-            </w:r>
-            <w:proofErr w:type="spellEnd"/>
-            <w:r>
-              <w:rPr>
-                <w:lang w:val="en-US"/>
-              </w:rPr>
-              <w:t>, category, year</w:t>
+              <w:t>nominee, track_artist, track_genre, category, year</w:t>
             </w:r>
           </w:p>
         </w:tc>
@@ -986,23 +800,7 @@
               <w:t>1. Concentración por Género:</w:t>
             </w:r>
             <w:r>
-              <w:t xml:space="preserve"> </w:t>
-            </w:r>
-            <w:proofErr w:type="spellStart"/>
-            <w:r>
-              <w:t>Treemap</w:t>
-            </w:r>
-            <w:proofErr w:type="spellEnd"/>
-            <w:r>
-              <w:t xml:space="preserve"> o gráfico de pastel/barras con el porcentaje de Grammys acumulados por </w:t>
-            </w:r>
-            <w:proofErr w:type="spellStart"/>
-            <w:r>
-              <w:t>track_genre</w:t>
-            </w:r>
-            <w:proofErr w:type="spellEnd"/>
-            <w:r>
-              <w:t>.</w:t>
+              <w:t xml:space="preserve"> Treemap o gráfico de pastel/barras con el porcentaje de Grammys acumulados por track_genre.</w:t>
             </w:r>
           </w:p>
           <w:p>
@@ -1022,42 +820,10 @@
                 <w:b/>
                 <w:bCs/>
               </w:rPr>
-              <w:t xml:space="preserve">2. </w:t>
-            </w:r>
-            <w:proofErr w:type="spellStart"/>
-            <w:r>
-              <w:rPr>
-                <w:b/>
-                <w:bCs/>
-              </w:rPr>
-              <w:t>Heatmap</w:t>
-            </w:r>
-            <w:proofErr w:type="spellEnd"/>
-            <w:r>
-              <w:rPr>
-                <w:b/>
-                <w:bCs/>
-              </w:rPr>
-              <w:t xml:space="preserve"> de Coincidencia:</w:t>
-            </w:r>
-            <w:r>
-              <w:t xml:space="preserve"> Matriz de correlación entre la categoría oficial del Grammy (</w:t>
-            </w:r>
-            <w:proofErr w:type="spellStart"/>
-            <w:r>
-              <w:t>category</w:t>
-            </w:r>
-            <w:proofErr w:type="spellEnd"/>
-            <w:r>
-              <w:t>) y el género comercial en Spotify (</w:t>
-            </w:r>
-            <w:proofErr w:type="spellStart"/>
-            <w:r>
-              <w:t>track_genre</w:t>
-            </w:r>
-            <w:proofErr w:type="spellEnd"/>
-            <w:r>
-              <w:t>).</w:t>
+              <w:t>2. Heatmap de Coincidencia:</w:t>
+            </w:r>
+            <w:r>
+              <w:t xml:space="preserve"> Matriz de correlación entre la categoría oficial del Grammy (category) y el género comercial en Spotify (track_genre).</w:t>
             </w:r>
           </w:p>
           <w:p>
@@ -1108,13 +874,8 @@
         <w:ind w:left="720"/>
         <w:jc w:val="both"/>
       </w:pPr>
-      <w:proofErr w:type="spellStart"/>
       <w:r>
-        <w:t>Validation</w:t>
-      </w:r>
-      <w:proofErr w:type="spellEnd"/>
-      <w:r>
-        <w:t xml:space="preserve"> Data(Spotify)</w:t>
+        <w:t>Validation Data(Spotify)</w:t>
       </w:r>
     </w:p>
     <w:tbl>
@@ -1170,7 +931,6 @@
                 <w:szCs w:val="18"/>
               </w:rPr>
             </w:pPr>
-            <w:proofErr w:type="spellStart"/>
             <w:r>
               <w:rPr>
                 <w:b/>
@@ -1181,7 +941,6 @@
               <w:lastRenderedPageBreak/>
               <w:t>Attribute</w:t>
             </w:r>
-            <w:proofErr w:type="spellEnd"/>
           </w:p>
         </w:tc>
         <w:tc>
@@ -1210,7 +969,6 @@
                 <w:szCs w:val="18"/>
               </w:rPr>
             </w:pPr>
-            <w:proofErr w:type="spellStart"/>
             <w:r>
               <w:rPr>
                 <w:b/>
@@ -1218,9 +976,36 @@
                 <w:sz w:val="18"/>
                 <w:szCs w:val="18"/>
               </w:rPr>
-              <w:t>Profiling</w:t>
-            </w:r>
-            <w:proofErr w:type="spellEnd"/>
+              <w:t>Profiling Evidence</w:t>
+            </w:r>
+          </w:p>
+        </w:tc>
+        <w:tc>
+          <w:tcPr>
+            <w:tcW w:w="0" w:type="auto"/>
+            <w:tcBorders>
+              <w:top w:val="single" w:sz="6" w:space="0" w:color="C4C7C5"/>
+              <w:left w:val="single" w:sz="6" w:space="0" w:color="C4C7C5"/>
+              <w:bottom w:val="single" w:sz="6" w:space="0" w:color="C4C7C5"/>
+              <w:right w:val="single" w:sz="6" w:space="0" w:color="C4C7C5"/>
+            </w:tcBorders>
+            <w:tcMar>
+              <w:top w:w="120" w:type="dxa"/>
+              <w:left w:w="180" w:type="dxa"/>
+              <w:bottom w:w="120" w:type="dxa"/>
+              <w:right w:w="180" w:type="dxa"/>
+            </w:tcMar>
+            <w:vAlign w:val="center"/>
+            <w:hideMark/>
+          </w:tcPr>
+          <w:p>
+            <w:pPr>
+              <w:jc w:val="both"/>
+              <w:rPr>
+                <w:sz w:val="18"/>
+                <w:szCs w:val="18"/>
+              </w:rPr>
+            </w:pPr>
             <w:r>
               <w:rPr>
                 <w:b/>
@@ -1228,9 +1013,36 @@
                 <w:sz w:val="18"/>
                 <w:szCs w:val="18"/>
               </w:rPr>
-              <w:t xml:space="preserve"> </w:t>
-            </w:r>
-            <w:proofErr w:type="spellStart"/>
+              <w:t>Possible Quality Risk</w:t>
+            </w:r>
+          </w:p>
+        </w:tc>
+        <w:tc>
+          <w:tcPr>
+            <w:tcW w:w="0" w:type="auto"/>
+            <w:tcBorders>
+              <w:top w:val="single" w:sz="6" w:space="0" w:color="C4C7C5"/>
+              <w:left w:val="single" w:sz="6" w:space="0" w:color="C4C7C5"/>
+              <w:bottom w:val="single" w:sz="6" w:space="0" w:color="C4C7C5"/>
+              <w:right w:val="single" w:sz="6" w:space="0" w:color="C4C7C5"/>
+            </w:tcBorders>
+            <w:tcMar>
+              <w:top w:w="120" w:type="dxa"/>
+              <w:left w:w="180" w:type="dxa"/>
+              <w:bottom w:w="120" w:type="dxa"/>
+              <w:right w:w="180" w:type="dxa"/>
+            </w:tcMar>
+            <w:vAlign w:val="center"/>
+            <w:hideMark/>
+          </w:tcPr>
+          <w:p>
+            <w:pPr>
+              <w:jc w:val="both"/>
+              <w:rPr>
+                <w:sz w:val="18"/>
+                <w:szCs w:val="18"/>
+              </w:rPr>
+            </w:pPr>
             <w:r>
               <w:rPr>
                 <w:b/>
@@ -1238,9 +1050,8 @@
                 <w:sz w:val="18"/>
                 <w:szCs w:val="18"/>
               </w:rPr>
-              <w:t>Evidence</w:t>
-            </w:r>
-            <w:proofErr w:type="spellEnd"/>
+              <w:t>Quality Dimension</w:t>
+            </w:r>
           </w:p>
         </w:tc>
         <w:tc>
@@ -1269,7 +1080,6 @@
                 <w:szCs w:val="18"/>
               </w:rPr>
             </w:pPr>
-            <w:proofErr w:type="spellStart"/>
             <w:r>
               <w:rPr>
                 <w:b/>
@@ -1277,9 +1087,36 @@
                 <w:sz w:val="18"/>
                 <w:szCs w:val="18"/>
               </w:rPr>
-              <w:t>Possible</w:t>
-            </w:r>
-            <w:proofErr w:type="spellEnd"/>
+              <w:t>Quality Rule</w:t>
+            </w:r>
+          </w:p>
+        </w:tc>
+        <w:tc>
+          <w:tcPr>
+            <w:tcW w:w="0" w:type="auto"/>
+            <w:tcBorders>
+              <w:top w:val="single" w:sz="6" w:space="0" w:color="C4C7C5"/>
+              <w:left w:val="single" w:sz="6" w:space="0" w:color="C4C7C5"/>
+              <w:bottom w:val="single" w:sz="6" w:space="0" w:color="C4C7C5"/>
+              <w:right w:val="single" w:sz="6" w:space="0" w:color="C4C7C5"/>
+            </w:tcBorders>
+            <w:tcMar>
+              <w:top w:w="120" w:type="dxa"/>
+              <w:left w:w="180" w:type="dxa"/>
+              <w:bottom w:w="120" w:type="dxa"/>
+              <w:right w:w="180" w:type="dxa"/>
+            </w:tcMar>
+            <w:vAlign w:val="center"/>
+            <w:hideMark/>
+          </w:tcPr>
+          <w:p>
+            <w:pPr>
+              <w:jc w:val="both"/>
+              <w:rPr>
+                <w:sz w:val="18"/>
+                <w:szCs w:val="18"/>
+              </w:rPr>
+            </w:pPr>
             <w:r>
               <w:rPr>
                 <w:b/>
@@ -1287,240 +1124,70 @@
                 <w:sz w:val="18"/>
                 <w:szCs w:val="18"/>
               </w:rPr>
-              <w:t xml:space="preserve"> </w:t>
-            </w:r>
-            <w:proofErr w:type="spellStart"/>
+              <w:t>Metric</w:t>
+            </w:r>
+          </w:p>
+        </w:tc>
+        <w:tc>
+          <w:tcPr>
+            <w:tcW w:w="0" w:type="auto"/>
+            <w:tcBorders>
+              <w:top w:val="single" w:sz="6" w:space="0" w:color="C4C7C5"/>
+              <w:left w:val="single" w:sz="6" w:space="0" w:color="C4C7C5"/>
+              <w:bottom w:val="single" w:sz="6" w:space="0" w:color="C4C7C5"/>
+              <w:right w:val="single" w:sz="6" w:space="0" w:color="C4C7C5"/>
+            </w:tcBorders>
+            <w:tcMar>
+              <w:top w:w="120" w:type="dxa"/>
+              <w:left w:w="180" w:type="dxa"/>
+              <w:bottom w:w="120" w:type="dxa"/>
+              <w:right w:w="180" w:type="dxa"/>
+            </w:tcMar>
+            <w:vAlign w:val="center"/>
+            <w:hideMark/>
+          </w:tcPr>
+          <w:p>
+            <w:pPr>
+              <w:jc w:val="both"/>
+            </w:pPr>
             <w:r>
               <w:rPr>
                 <w:b/>
                 <w:bCs/>
-                <w:sz w:val="18"/>
-                <w:szCs w:val="18"/>
-              </w:rPr>
-              <w:t>Quality</w:t>
-            </w:r>
-            <w:proofErr w:type="spellEnd"/>
+              </w:rPr>
+              <w:t>Threshold</w:t>
+            </w:r>
+          </w:p>
+        </w:tc>
+        <w:tc>
+          <w:tcPr>
+            <w:tcW w:w="0" w:type="auto"/>
+            <w:tcBorders>
+              <w:top w:val="single" w:sz="6" w:space="0" w:color="C4C7C5"/>
+              <w:left w:val="single" w:sz="6" w:space="0" w:color="C4C7C5"/>
+              <w:bottom w:val="single" w:sz="6" w:space="0" w:color="C4C7C5"/>
+              <w:right w:val="single" w:sz="6" w:space="0" w:color="C4C7C5"/>
+            </w:tcBorders>
+            <w:tcMar>
+              <w:top w:w="120" w:type="dxa"/>
+              <w:left w:w="180" w:type="dxa"/>
+              <w:bottom w:w="120" w:type="dxa"/>
+              <w:right w:w="180" w:type="dxa"/>
+            </w:tcMar>
+            <w:vAlign w:val="center"/>
+            <w:hideMark/>
+          </w:tcPr>
+          <w:p>
+            <w:pPr>
+              <w:jc w:val="both"/>
+            </w:pPr>
             <w:r>
               <w:rPr>
                 <w:b/>
                 <w:bCs/>
-                <w:sz w:val="18"/>
-                <w:szCs w:val="18"/>
-              </w:rPr>
-              <w:t xml:space="preserve"> Risk</w:t>
-            </w:r>
-          </w:p>
-        </w:tc>
-        <w:tc>
-          <w:tcPr>
-            <w:tcW w:w="0" w:type="auto"/>
-            <w:tcBorders>
-              <w:top w:val="single" w:sz="6" w:space="0" w:color="C4C7C5"/>
-              <w:left w:val="single" w:sz="6" w:space="0" w:color="C4C7C5"/>
-              <w:bottom w:val="single" w:sz="6" w:space="0" w:color="C4C7C5"/>
-              <w:right w:val="single" w:sz="6" w:space="0" w:color="C4C7C5"/>
-            </w:tcBorders>
-            <w:tcMar>
-              <w:top w:w="120" w:type="dxa"/>
-              <w:left w:w="180" w:type="dxa"/>
-              <w:bottom w:w="120" w:type="dxa"/>
-              <w:right w:w="180" w:type="dxa"/>
-            </w:tcMar>
-            <w:vAlign w:val="center"/>
-            <w:hideMark/>
-          </w:tcPr>
-          <w:p>
-            <w:pPr>
-              <w:jc w:val="both"/>
-              <w:rPr>
-                <w:sz w:val="18"/>
-                <w:szCs w:val="18"/>
-              </w:rPr>
-            </w:pPr>
-            <w:proofErr w:type="spellStart"/>
-            <w:r>
-              <w:rPr>
-                <w:b/>
-                <w:bCs/>
-                <w:sz w:val="18"/>
-                <w:szCs w:val="18"/>
-              </w:rPr>
-              <w:t>Quality</w:t>
-            </w:r>
-            <w:proofErr w:type="spellEnd"/>
-            <w:r>
-              <w:rPr>
-                <w:b/>
-                <w:bCs/>
-                <w:sz w:val="18"/>
-                <w:szCs w:val="18"/>
-              </w:rPr>
-              <w:t xml:space="preserve"> </w:t>
-            </w:r>
-            <w:proofErr w:type="spellStart"/>
-            <w:r>
-              <w:rPr>
-                <w:b/>
-                <w:bCs/>
-                <w:sz w:val="18"/>
-                <w:szCs w:val="18"/>
-              </w:rPr>
-              <w:t>Dimension</w:t>
-            </w:r>
-            <w:proofErr w:type="spellEnd"/>
-          </w:p>
-        </w:tc>
-        <w:tc>
-          <w:tcPr>
-            <w:tcW w:w="0" w:type="auto"/>
-            <w:tcBorders>
-              <w:top w:val="single" w:sz="6" w:space="0" w:color="C4C7C5"/>
-              <w:left w:val="single" w:sz="6" w:space="0" w:color="C4C7C5"/>
-              <w:bottom w:val="single" w:sz="6" w:space="0" w:color="C4C7C5"/>
-              <w:right w:val="single" w:sz="6" w:space="0" w:color="C4C7C5"/>
-            </w:tcBorders>
-            <w:tcMar>
-              <w:top w:w="120" w:type="dxa"/>
-              <w:left w:w="180" w:type="dxa"/>
-              <w:bottom w:w="120" w:type="dxa"/>
-              <w:right w:w="180" w:type="dxa"/>
-            </w:tcMar>
-            <w:vAlign w:val="center"/>
-            <w:hideMark/>
-          </w:tcPr>
-          <w:p>
-            <w:pPr>
-              <w:jc w:val="both"/>
-              <w:rPr>
-                <w:sz w:val="18"/>
-                <w:szCs w:val="18"/>
-              </w:rPr>
-            </w:pPr>
-            <w:proofErr w:type="spellStart"/>
-            <w:r>
-              <w:rPr>
-                <w:b/>
-                <w:bCs/>
-                <w:sz w:val="18"/>
-                <w:szCs w:val="18"/>
-              </w:rPr>
-              <w:t>Quality</w:t>
-            </w:r>
-            <w:proofErr w:type="spellEnd"/>
-            <w:r>
-              <w:rPr>
-                <w:b/>
-                <w:bCs/>
-                <w:sz w:val="18"/>
-                <w:szCs w:val="18"/>
-              </w:rPr>
-              <w:t xml:space="preserve"> Rule</w:t>
-            </w:r>
-          </w:p>
-        </w:tc>
-        <w:tc>
-          <w:tcPr>
-            <w:tcW w:w="0" w:type="auto"/>
-            <w:tcBorders>
-              <w:top w:val="single" w:sz="6" w:space="0" w:color="C4C7C5"/>
-              <w:left w:val="single" w:sz="6" w:space="0" w:color="C4C7C5"/>
-              <w:bottom w:val="single" w:sz="6" w:space="0" w:color="C4C7C5"/>
-              <w:right w:val="single" w:sz="6" w:space="0" w:color="C4C7C5"/>
-            </w:tcBorders>
-            <w:tcMar>
-              <w:top w:w="120" w:type="dxa"/>
-              <w:left w:w="180" w:type="dxa"/>
-              <w:bottom w:w="120" w:type="dxa"/>
-              <w:right w:w="180" w:type="dxa"/>
-            </w:tcMar>
-            <w:vAlign w:val="center"/>
-            <w:hideMark/>
-          </w:tcPr>
-          <w:p>
-            <w:pPr>
-              <w:jc w:val="both"/>
-              <w:rPr>
-                <w:sz w:val="18"/>
-                <w:szCs w:val="18"/>
-              </w:rPr>
-            </w:pPr>
-            <w:proofErr w:type="spellStart"/>
-            <w:r>
-              <w:rPr>
-                <w:b/>
-                <w:bCs/>
-                <w:sz w:val="18"/>
-                <w:szCs w:val="18"/>
-              </w:rPr>
-              <w:t>Metric</w:t>
-            </w:r>
-            <w:proofErr w:type="spellEnd"/>
-          </w:p>
-        </w:tc>
-        <w:tc>
-          <w:tcPr>
-            <w:tcW w:w="0" w:type="auto"/>
-            <w:tcBorders>
-              <w:top w:val="single" w:sz="6" w:space="0" w:color="C4C7C5"/>
-              <w:left w:val="single" w:sz="6" w:space="0" w:color="C4C7C5"/>
-              <w:bottom w:val="single" w:sz="6" w:space="0" w:color="C4C7C5"/>
-              <w:right w:val="single" w:sz="6" w:space="0" w:color="C4C7C5"/>
-            </w:tcBorders>
-            <w:tcMar>
-              <w:top w:w="120" w:type="dxa"/>
-              <w:left w:w="180" w:type="dxa"/>
-              <w:bottom w:w="120" w:type="dxa"/>
-              <w:right w:w="180" w:type="dxa"/>
-            </w:tcMar>
-            <w:vAlign w:val="center"/>
-            <w:hideMark/>
-          </w:tcPr>
-          <w:p>
-            <w:pPr>
-              <w:jc w:val="both"/>
-            </w:pPr>
-            <w:proofErr w:type="spellStart"/>
-            <w:r>
-              <w:rPr>
-                <w:b/>
-                <w:bCs/>
-              </w:rPr>
-              <w:t>Threshold</w:t>
-            </w:r>
-            <w:proofErr w:type="spellEnd"/>
-          </w:p>
-        </w:tc>
-        <w:tc>
-          <w:tcPr>
-            <w:tcW w:w="0" w:type="auto"/>
-            <w:tcBorders>
-              <w:top w:val="single" w:sz="6" w:space="0" w:color="C4C7C5"/>
-              <w:left w:val="single" w:sz="6" w:space="0" w:color="C4C7C5"/>
-              <w:bottom w:val="single" w:sz="6" w:space="0" w:color="C4C7C5"/>
-              <w:right w:val="single" w:sz="6" w:space="0" w:color="C4C7C5"/>
-            </w:tcBorders>
-            <w:tcMar>
-              <w:top w:w="120" w:type="dxa"/>
-              <w:left w:w="180" w:type="dxa"/>
-              <w:bottom w:w="120" w:type="dxa"/>
-              <w:right w:w="180" w:type="dxa"/>
-            </w:tcMar>
-            <w:vAlign w:val="center"/>
-            <w:hideMark/>
-          </w:tcPr>
-          <w:p>
-            <w:pPr>
-              <w:jc w:val="both"/>
-            </w:pPr>
-            <w:proofErr w:type="spellStart"/>
-            <w:r>
-              <w:rPr>
-                <w:b/>
-                <w:bCs/>
               </w:rPr>
               <w:t>Severity</w:t>
             </w:r>
-            <w:proofErr w:type="spellEnd"/>
           </w:p>
         </w:tc>
       </w:tr>
@@ -1555,15 +1222,55 @@
                 <w:szCs w:val="18"/>
               </w:rPr>
             </w:pPr>
-            <w:proofErr w:type="spellStart"/>
-            <w:r>
-              <w:rPr>
-                <w:sz w:val="18"/>
-                <w:szCs w:val="18"/>
-              </w:rPr>
-              <w:t>track_id</w:t>
-            </w:r>
-            <w:proofErr w:type="spellEnd"/>
+            <w:r>
+              <w:rPr>
+                <w:sz w:val="18"/>
+                <w:szCs w:val="18"/>
+              </w:rPr>
+              <w:t xml:space="preserve">track_id </w:t>
+            </w:r>
+          </w:p>
+        </w:tc>
+        <w:tc>
+          <w:tcPr>
+            <w:tcW w:w="0" w:type="auto"/>
+            <w:tcBorders>
+              <w:top w:val="single" w:sz="6" w:space="0" w:color="C4C7C5"/>
+              <w:left w:val="single" w:sz="6" w:space="0" w:color="C4C7C5"/>
+              <w:bottom w:val="single" w:sz="6" w:space="0" w:color="C4C7C5"/>
+              <w:right w:val="single" w:sz="6" w:space="0" w:color="C4C7C5"/>
+            </w:tcBorders>
+            <w:tcMar>
+              <w:top w:w="120" w:type="dxa"/>
+              <w:left w:w="180" w:type="dxa"/>
+              <w:bottom w:w="120" w:type="dxa"/>
+              <w:right w:w="180" w:type="dxa"/>
+            </w:tcMar>
+            <w:vAlign w:val="center"/>
+            <w:hideMark/>
+          </w:tcPr>
+          <w:p>
+            <w:pPr>
+              <w:jc w:val="both"/>
+              <w:rPr>
+                <w:sz w:val="18"/>
+                <w:szCs w:val="18"/>
+              </w:rPr>
+            </w:pPr>
+            <w:r>
+              <w:rPr>
+                <w:sz w:val="18"/>
+                <w:szCs w:val="18"/>
+              </w:rPr>
+              <w:t xml:space="preserve">0 Missing values, </w:t>
+            </w:r>
+            <w:r>
+              <w:rPr>
+                <w:sz w:val="18"/>
+                <w:szCs w:val="18"/>
+              </w:rPr>
+              <w:t>89741</w:t>
+            </w:r>
             <w:r>
               <w:rPr>
                 <w:sz w:val="18"/>
@@ -1571,6 +1278,13 @@
               </w:rPr>
               <w:t xml:space="preserve"> </w:t>
             </w:r>
+            <w:r>
+              <w:rPr>
+                <w:sz w:val="18"/>
+                <w:szCs w:val="18"/>
+              </w:rPr>
+              <w:t>distinct categories.</w:t>
+            </w:r>
           </w:p>
         </w:tc>
         <w:tc>
@@ -1604,85 +1318,14 @@
                 <w:sz w:val="18"/>
                 <w:szCs w:val="18"/>
               </w:rPr>
-              <w:t xml:space="preserve">0 </w:t>
-            </w:r>
-            <w:proofErr w:type="spellStart"/>
-            <w:r>
-              <w:rPr>
-                <w:sz w:val="18"/>
-                <w:szCs w:val="18"/>
-              </w:rPr>
-              <w:t>Missing</w:t>
-            </w:r>
-            <w:proofErr w:type="spellEnd"/>
-            <w:r>
-              <w:rPr>
-                <w:sz w:val="18"/>
-                <w:szCs w:val="18"/>
-              </w:rPr>
-              <w:t xml:space="preserve"> </w:t>
-            </w:r>
-            <w:proofErr w:type="spellStart"/>
-            <w:r>
-              <w:rPr>
-                <w:sz w:val="18"/>
-                <w:szCs w:val="18"/>
-              </w:rPr>
-              <w:t>values</w:t>
-            </w:r>
-            <w:proofErr w:type="spellEnd"/>
-            <w:r>
-              <w:rPr>
-                <w:sz w:val="18"/>
-                <w:szCs w:val="18"/>
-              </w:rPr>
-              <w:t xml:space="preserve">, </w:t>
-            </w:r>
-            <w:r>
-              <w:rPr>
-                <w:sz w:val="18"/>
-                <w:szCs w:val="18"/>
-              </w:rPr>
-              <w:t>89741</w:t>
-            </w:r>
-            <w:r>
-              <w:rPr>
-                <w:sz w:val="18"/>
-                <w:szCs w:val="18"/>
-              </w:rPr>
-              <w:t xml:space="preserve"> </w:t>
-            </w:r>
-            <w:proofErr w:type="spellStart"/>
-            <w:r>
-              <w:rPr>
-                <w:sz w:val="18"/>
-                <w:szCs w:val="18"/>
-              </w:rPr>
-              <w:t>distinct</w:t>
-            </w:r>
-            <w:proofErr w:type="spellEnd"/>
-            <w:r>
-              <w:rPr>
-                <w:sz w:val="18"/>
-                <w:szCs w:val="18"/>
-              </w:rPr>
-              <w:t xml:space="preserve"> </w:t>
-            </w:r>
-            <w:proofErr w:type="spellStart"/>
-            <w:r>
-              <w:rPr>
-                <w:sz w:val="18"/>
-                <w:szCs w:val="18"/>
-              </w:rPr>
-              <w:t>categories</w:t>
-            </w:r>
-            <w:proofErr w:type="spellEnd"/>
-            <w:r>
-              <w:rPr>
-                <w:sz w:val="18"/>
-                <w:szCs w:val="18"/>
-              </w:rPr>
-              <w:t>.</w:t>
+              <w:t xml:space="preserve">valores nulos </w:t>
+            </w:r>
+            <w:r>
+              <w:rPr>
+                <w:sz w:val="18"/>
+                <w:szCs w:val="18"/>
+              </w:rPr>
+              <w:t>pondrían en riesgo el análisis.</w:t>
             </w:r>
           </w:p>
         </w:tc>
@@ -1717,14 +1360,7 @@
                 <w:sz w:val="18"/>
                 <w:szCs w:val="18"/>
               </w:rPr>
-              <w:t xml:space="preserve">valores nulos </w:t>
-            </w:r>
-            <w:r>
-              <w:rPr>
-                <w:sz w:val="18"/>
-                <w:szCs w:val="18"/>
-              </w:rPr>
-              <w:t>pondrían en riesgo el análisis.</w:t>
+              <w:t xml:space="preserve">Completeness </w:t>
             </w:r>
           </w:p>
         </w:tc>
@@ -1752,23 +1388,24 @@
               <w:rPr>
                 <w:sz w:val="18"/>
                 <w:szCs w:val="18"/>
-              </w:rPr>
-            </w:pPr>
-            <w:proofErr w:type="spellStart"/>
-            <w:r>
-              <w:rPr>
-                <w:sz w:val="18"/>
-                <w:szCs w:val="18"/>
-              </w:rPr>
-              <w:t>Completeness</w:t>
-            </w:r>
-            <w:proofErr w:type="spellEnd"/>
-            <w:r>
-              <w:rPr>
-                <w:sz w:val="18"/>
-                <w:szCs w:val="18"/>
-              </w:rPr>
-              <w:t xml:space="preserve"> </w:t>
+                <w:lang w:val="en-US"/>
+              </w:rPr>
+            </w:pPr>
+            <w:r>
+              <w:rPr>
+                <w:sz w:val="18"/>
+                <w:szCs w:val="18"/>
+                <w:lang w:val="en-US"/>
+              </w:rPr>
+              <w:t xml:space="preserve">track_id </w:t>
+            </w:r>
+            <w:r>
+              <w:rPr>
+                <w:sz w:val="18"/>
+                <w:szCs w:val="18"/>
+                <w:lang w:val="en-US"/>
+              </w:rPr>
+              <w:t>must be present and belong to the allowed catalog/domain.</w:t>
             </w:r>
           </w:p>
         </w:tc>
@@ -1796,34 +1433,14 @@
               <w:rPr>
                 <w:sz w:val="18"/>
                 <w:szCs w:val="18"/>
-                <w:lang w:val="en-US"/>
-              </w:rPr>
-            </w:pPr>
-            <w:proofErr w:type="spellStart"/>
-            <w:r>
-              <w:rPr>
-                <w:sz w:val="18"/>
-                <w:szCs w:val="18"/>
-                <w:lang w:val="en-US"/>
-              </w:rPr>
-              <w:t>track_id</w:t>
-            </w:r>
-            <w:proofErr w:type="spellEnd"/>
-            <w:r>
-              <w:rPr>
-                <w:sz w:val="18"/>
-                <w:szCs w:val="18"/>
-                <w:lang w:val="en-US"/>
-              </w:rPr>
-              <w:t xml:space="preserve"> </w:t>
-            </w:r>
-            <w:r>
-              <w:rPr>
-                <w:sz w:val="18"/>
-                <w:szCs w:val="18"/>
-                <w:lang w:val="en-US"/>
-              </w:rPr>
-              <w:t>must be present and belong to the allowed catalog/domain.</w:t>
+              </w:rPr>
+            </w:pPr>
+            <w:r>
+              <w:rPr>
+                <w:sz w:val="18"/>
+                <w:szCs w:val="18"/>
+              </w:rPr>
+              <w:t>% Valid non-null records</w:t>
             </w:r>
           </w:p>
         </w:tc>
@@ -1848,43 +1465,16 @@
           <w:p>
             <w:pPr>
               <w:jc w:val="both"/>
-              <w:rPr>
-                <w:sz w:val="18"/>
-                <w:szCs w:val="18"/>
-              </w:rPr>
-            </w:pPr>
-            <w:r>
-              <w:rPr>
-                <w:sz w:val="18"/>
-                <w:szCs w:val="18"/>
-              </w:rPr>
-              <w:t>% Valid non-</w:t>
-            </w:r>
-            <w:proofErr w:type="spellStart"/>
-            <w:r>
-              <w:rPr>
-                <w:sz w:val="18"/>
-                <w:szCs w:val="18"/>
-              </w:rPr>
-              <w:t>null</w:t>
-            </w:r>
-            <w:proofErr w:type="spellEnd"/>
-            <w:r>
-              <w:rPr>
-                <w:sz w:val="18"/>
-                <w:szCs w:val="18"/>
-              </w:rPr>
-              <w:t xml:space="preserve"> </w:t>
-            </w:r>
-            <w:proofErr w:type="spellStart"/>
-            <w:r>
-              <w:rPr>
-                <w:sz w:val="18"/>
-                <w:szCs w:val="18"/>
-              </w:rPr>
-              <w:t>records</w:t>
-            </w:r>
-            <w:proofErr w:type="spellEnd"/>
+            </w:pPr>
+            <w:r>
+              <w:t>&gt;</w:t>
+            </w:r>
+            <w:r>
+              <w:t>100</w:t>
+            </w:r>
+            <w:r>
+              <w:t>%</w:t>
+            </w:r>
           </w:p>
         </w:tc>
         <w:tc>
@@ -1910,43 +1500,8 @@
               <w:jc w:val="both"/>
             </w:pPr>
             <w:r>
-              <w:t>&gt;</w:t>
-            </w:r>
-            <w:r>
-              <w:t>100</w:t>
-            </w:r>
-            <w:r>
-              <w:t>%</w:t>
-            </w:r>
-          </w:p>
-        </w:tc>
-        <w:tc>
-          <w:tcPr>
-            <w:tcW w:w="0" w:type="auto"/>
-            <w:tcBorders>
-              <w:top w:val="single" w:sz="6" w:space="0" w:color="C4C7C5"/>
-              <w:left w:val="single" w:sz="6" w:space="0" w:color="C4C7C5"/>
-              <w:bottom w:val="single" w:sz="6" w:space="0" w:color="C4C7C5"/>
-              <w:right w:val="single" w:sz="6" w:space="0" w:color="C4C7C5"/>
-            </w:tcBorders>
-            <w:tcMar>
-              <w:top w:w="120" w:type="dxa"/>
-              <w:left w:w="180" w:type="dxa"/>
-              <w:bottom w:w="120" w:type="dxa"/>
-              <w:right w:w="180" w:type="dxa"/>
-            </w:tcMar>
-            <w:vAlign w:val="center"/>
-            <w:hideMark/>
-          </w:tcPr>
-          <w:p>
-            <w:pPr>
-              <w:jc w:val="both"/>
-            </w:pPr>
-            <w:proofErr w:type="spellStart"/>
-            <w:r>
               <w:t>Critical</w:t>
             </w:r>
-            <w:proofErr w:type="spellEnd"/>
           </w:p>
         </w:tc>
       </w:tr>
@@ -1981,15 +1536,210 @@
                 <w:szCs w:val="18"/>
               </w:rPr>
             </w:pPr>
-            <w:proofErr w:type="spellStart"/>
-            <w:r>
-              <w:rPr>
-                <w:sz w:val="18"/>
-                <w:szCs w:val="18"/>
-              </w:rPr>
-              <w:t>Artists</w:t>
-            </w:r>
-            <w:proofErr w:type="spellEnd"/>
+            <w:r>
+              <w:rPr>
+                <w:sz w:val="18"/>
+                <w:szCs w:val="18"/>
+              </w:rPr>
+              <w:t xml:space="preserve">Artists </w:t>
+            </w:r>
+          </w:p>
+        </w:tc>
+        <w:tc>
+          <w:tcPr>
+            <w:tcW w:w="0" w:type="auto"/>
+            <w:tcBorders>
+              <w:top w:val="single" w:sz="6" w:space="0" w:color="C4C7C5"/>
+              <w:left w:val="single" w:sz="6" w:space="0" w:color="C4C7C5"/>
+              <w:bottom w:val="single" w:sz="6" w:space="0" w:color="C4C7C5"/>
+              <w:right w:val="single" w:sz="6" w:space="0" w:color="C4C7C5"/>
+            </w:tcBorders>
+            <w:tcMar>
+              <w:top w:w="120" w:type="dxa"/>
+              <w:left w:w="180" w:type="dxa"/>
+              <w:bottom w:w="120" w:type="dxa"/>
+              <w:right w:w="180" w:type="dxa"/>
+            </w:tcMar>
+            <w:vAlign w:val="center"/>
+            <w:hideMark/>
+          </w:tcPr>
+          <w:p>
+            <w:pPr>
+              <w:jc w:val="both"/>
+              <w:rPr>
+                <w:sz w:val="18"/>
+                <w:szCs w:val="18"/>
+              </w:rPr>
+            </w:pPr>
+            <w:r>
+              <w:rPr>
+                <w:sz w:val="18"/>
+                <w:szCs w:val="18"/>
+              </w:rPr>
+              <w:t xml:space="preserve">1 valor faltante, </w:t>
+            </w:r>
+            <w:r>
+              <w:rPr>
+                <w:sz w:val="18"/>
+                <w:szCs w:val="18"/>
+              </w:rPr>
+              <w:t>31437 valores distintos</w:t>
+            </w:r>
+          </w:p>
+        </w:tc>
+        <w:tc>
+          <w:tcPr>
+            <w:tcW w:w="0" w:type="auto"/>
+            <w:tcBorders>
+              <w:top w:val="single" w:sz="6" w:space="0" w:color="C4C7C5"/>
+              <w:left w:val="single" w:sz="6" w:space="0" w:color="C4C7C5"/>
+              <w:bottom w:val="single" w:sz="6" w:space="0" w:color="C4C7C5"/>
+              <w:right w:val="single" w:sz="6" w:space="0" w:color="C4C7C5"/>
+            </w:tcBorders>
+            <w:tcMar>
+              <w:top w:w="120" w:type="dxa"/>
+              <w:left w:w="180" w:type="dxa"/>
+              <w:bottom w:w="120" w:type="dxa"/>
+              <w:right w:w="180" w:type="dxa"/>
+            </w:tcMar>
+            <w:vAlign w:val="center"/>
+            <w:hideMark/>
+          </w:tcPr>
+          <w:p>
+            <w:pPr>
+              <w:jc w:val="both"/>
+              <w:rPr>
+                <w:sz w:val="18"/>
+                <w:szCs w:val="18"/>
+              </w:rPr>
+            </w:pPr>
+            <w:r>
+              <w:rPr>
+                <w:sz w:val="18"/>
+                <w:szCs w:val="18"/>
+              </w:rPr>
+              <w:t>Los valores nulos pueden, gen</w:t>
+            </w:r>
+            <w:r>
+              <w:rPr>
+                <w:sz w:val="18"/>
+                <w:szCs w:val="18"/>
+              </w:rPr>
+              <w:t>erar problemas a la hora de hacer el análisis.</w:t>
+            </w:r>
+          </w:p>
+        </w:tc>
+        <w:tc>
+          <w:tcPr>
+            <w:tcW w:w="0" w:type="auto"/>
+            <w:tcBorders>
+              <w:top w:val="single" w:sz="6" w:space="0" w:color="C4C7C5"/>
+              <w:left w:val="single" w:sz="6" w:space="0" w:color="C4C7C5"/>
+              <w:bottom w:val="single" w:sz="6" w:space="0" w:color="C4C7C5"/>
+              <w:right w:val="single" w:sz="6" w:space="0" w:color="C4C7C5"/>
+            </w:tcBorders>
+            <w:tcMar>
+              <w:top w:w="120" w:type="dxa"/>
+              <w:left w:w="180" w:type="dxa"/>
+              <w:bottom w:w="120" w:type="dxa"/>
+              <w:right w:w="180" w:type="dxa"/>
+            </w:tcMar>
+            <w:vAlign w:val="center"/>
+            <w:hideMark/>
+          </w:tcPr>
+          <w:p>
+            <w:pPr>
+              <w:jc w:val="both"/>
+              <w:rPr>
+                <w:sz w:val="18"/>
+                <w:szCs w:val="18"/>
+              </w:rPr>
+            </w:pPr>
+            <w:r>
+              <w:rPr>
+                <w:sz w:val="18"/>
+                <w:szCs w:val="18"/>
+              </w:rPr>
+              <w:t>Completeness</w:t>
+            </w:r>
+          </w:p>
+        </w:tc>
+        <w:tc>
+          <w:tcPr>
+            <w:tcW w:w="0" w:type="auto"/>
+            <w:tcBorders>
+              <w:top w:val="single" w:sz="6" w:space="0" w:color="C4C7C5"/>
+              <w:left w:val="single" w:sz="6" w:space="0" w:color="C4C7C5"/>
+              <w:bottom w:val="single" w:sz="6" w:space="0" w:color="C4C7C5"/>
+              <w:right w:val="single" w:sz="6" w:space="0" w:color="C4C7C5"/>
+            </w:tcBorders>
+            <w:tcMar>
+              <w:top w:w="120" w:type="dxa"/>
+              <w:left w:w="180" w:type="dxa"/>
+              <w:bottom w:w="120" w:type="dxa"/>
+              <w:right w:w="180" w:type="dxa"/>
+            </w:tcMar>
+            <w:vAlign w:val="center"/>
+            <w:hideMark/>
+          </w:tcPr>
+          <w:p>
+            <w:pPr>
+              <w:jc w:val="both"/>
+              <w:rPr>
+                <w:sz w:val="18"/>
+                <w:szCs w:val="18"/>
+              </w:rPr>
+            </w:pPr>
+            <w:r>
+              <w:rPr>
+                <w:sz w:val="18"/>
+                <w:szCs w:val="18"/>
+              </w:rPr>
+              <w:t xml:space="preserve">Artist debe </w:t>
+            </w:r>
+            <w:r>
+              <w:rPr>
+                <w:sz w:val="18"/>
+                <w:szCs w:val="18"/>
+              </w:rPr>
+              <w:t xml:space="preserve">estar presente </w:t>
+            </w:r>
+            <w:r>
+              <w:rPr>
+                <w:sz w:val="18"/>
+                <w:szCs w:val="18"/>
+              </w:rPr>
+              <w:t>y pertenecer a un catalogo existente.</w:t>
+            </w:r>
+          </w:p>
+        </w:tc>
+        <w:tc>
+          <w:tcPr>
+            <w:tcW w:w="0" w:type="auto"/>
+            <w:tcBorders>
+              <w:top w:val="single" w:sz="6" w:space="0" w:color="C4C7C5"/>
+              <w:left w:val="single" w:sz="6" w:space="0" w:color="C4C7C5"/>
+              <w:bottom w:val="single" w:sz="6" w:space="0" w:color="C4C7C5"/>
+              <w:right w:val="single" w:sz="6" w:space="0" w:color="C4C7C5"/>
+            </w:tcBorders>
+            <w:tcMar>
+              <w:top w:w="120" w:type="dxa"/>
+              <w:left w:w="180" w:type="dxa"/>
+              <w:bottom w:w="120" w:type="dxa"/>
+              <w:right w:w="180" w:type="dxa"/>
+            </w:tcMar>
+            <w:vAlign w:val="center"/>
+            <w:hideMark/>
+          </w:tcPr>
+          <w:p>
+            <w:pPr>
+              <w:jc w:val="both"/>
+              <w:rPr>
+                <w:sz w:val="18"/>
+                <w:szCs w:val="18"/>
+                <w:lang w:val="en-US"/>
+              </w:rPr>
+            </w:pPr>
             <w:r>
               <w:rPr>
                 <w:sz w:val="18"/>
@@ -1997,6 +1747,13 @@
               </w:rPr>
               <w:t xml:space="preserve"> </w:t>
             </w:r>
+            <w:r>
+              <w:rPr>
+                <w:sz w:val="18"/>
+                <w:szCs w:val="18"/>
+              </w:rPr>
+              <w:t>% Valid non-null records</w:t>
+            </w:r>
           </w:p>
         </w:tc>
         <w:tc>
@@ -2020,24 +1777,18 @@
           <w:p>
             <w:pPr>
               <w:jc w:val="both"/>
-              <w:rPr>
-                <w:sz w:val="18"/>
-                <w:szCs w:val="18"/>
-              </w:rPr>
-            </w:pPr>
-            <w:r>
-              <w:rPr>
-                <w:sz w:val="18"/>
-                <w:szCs w:val="18"/>
-              </w:rPr>
-              <w:t xml:space="preserve">1 valor faltante, </w:t>
-            </w:r>
-            <w:r>
-              <w:rPr>
-                <w:sz w:val="18"/>
-                <w:szCs w:val="18"/>
-              </w:rPr>
-              <w:t>31437 valores distintos</w:t>
+            </w:pPr>
+            <w:r>
+              <w:t xml:space="preserve">&gt;= </w:t>
+            </w:r>
+            <w:r>
+              <w:t>9</w:t>
+            </w:r>
+            <w:r>
+              <w:t>8</w:t>
+            </w:r>
+            <w:r>
+              <w:t>%</w:t>
             </w:r>
           </w:p>
         </w:tc>
@@ -2062,260 +1813,10 @@
           <w:p>
             <w:pPr>
               <w:jc w:val="both"/>
-              <w:rPr>
-                <w:sz w:val="18"/>
-                <w:szCs w:val="18"/>
-              </w:rPr>
-            </w:pPr>
-            <w:r>
-              <w:rPr>
-                <w:sz w:val="18"/>
-                <w:szCs w:val="18"/>
-              </w:rPr>
-              <w:t>Los valores nulos pueden, gen</w:t>
-            </w:r>
-            <w:r>
-              <w:rPr>
-                <w:sz w:val="18"/>
-                <w:szCs w:val="18"/>
-              </w:rPr>
-              <w:t>erar problemas a la hora de hacer el análisis.</w:t>
-            </w:r>
-          </w:p>
-        </w:tc>
-        <w:tc>
-          <w:tcPr>
-            <w:tcW w:w="0" w:type="auto"/>
-            <w:tcBorders>
-              <w:top w:val="single" w:sz="6" w:space="0" w:color="C4C7C5"/>
-              <w:left w:val="single" w:sz="6" w:space="0" w:color="C4C7C5"/>
-              <w:bottom w:val="single" w:sz="6" w:space="0" w:color="C4C7C5"/>
-              <w:right w:val="single" w:sz="6" w:space="0" w:color="C4C7C5"/>
-            </w:tcBorders>
-            <w:tcMar>
-              <w:top w:w="120" w:type="dxa"/>
-              <w:left w:w="180" w:type="dxa"/>
-              <w:bottom w:w="120" w:type="dxa"/>
-              <w:right w:w="180" w:type="dxa"/>
-            </w:tcMar>
-            <w:vAlign w:val="center"/>
-            <w:hideMark/>
-          </w:tcPr>
-          <w:p>
-            <w:pPr>
-              <w:jc w:val="both"/>
-              <w:rPr>
-                <w:sz w:val="18"/>
-                <w:szCs w:val="18"/>
-              </w:rPr>
-            </w:pPr>
-            <w:proofErr w:type="spellStart"/>
-            <w:r>
-              <w:rPr>
-                <w:sz w:val="18"/>
-                <w:szCs w:val="18"/>
-              </w:rPr>
-              <w:t>Completeness</w:t>
-            </w:r>
-            <w:proofErr w:type="spellEnd"/>
-          </w:p>
-        </w:tc>
-        <w:tc>
-          <w:tcPr>
-            <w:tcW w:w="0" w:type="auto"/>
-            <w:tcBorders>
-              <w:top w:val="single" w:sz="6" w:space="0" w:color="C4C7C5"/>
-              <w:left w:val="single" w:sz="6" w:space="0" w:color="C4C7C5"/>
-              <w:bottom w:val="single" w:sz="6" w:space="0" w:color="C4C7C5"/>
-              <w:right w:val="single" w:sz="6" w:space="0" w:color="C4C7C5"/>
-            </w:tcBorders>
-            <w:tcMar>
-              <w:top w:w="120" w:type="dxa"/>
-              <w:left w:w="180" w:type="dxa"/>
-              <w:bottom w:w="120" w:type="dxa"/>
-              <w:right w:w="180" w:type="dxa"/>
-            </w:tcMar>
-            <w:vAlign w:val="center"/>
-            <w:hideMark/>
-          </w:tcPr>
-          <w:p>
-            <w:pPr>
-              <w:jc w:val="both"/>
-              <w:rPr>
-                <w:sz w:val="18"/>
-                <w:szCs w:val="18"/>
-              </w:rPr>
-            </w:pPr>
-            <w:r>
-              <w:rPr>
-                <w:sz w:val="18"/>
-                <w:szCs w:val="18"/>
-              </w:rPr>
-              <w:t xml:space="preserve">Artist debe </w:t>
-            </w:r>
-            <w:r>
-              <w:rPr>
-                <w:sz w:val="18"/>
-                <w:szCs w:val="18"/>
-              </w:rPr>
-              <w:t xml:space="preserve">estar presente </w:t>
-            </w:r>
-            <w:r>
-              <w:rPr>
-                <w:sz w:val="18"/>
-                <w:szCs w:val="18"/>
-              </w:rPr>
-              <w:t xml:space="preserve">y pertenecer a un </w:t>
-            </w:r>
-            <w:proofErr w:type="spellStart"/>
-            <w:r>
-              <w:rPr>
-                <w:sz w:val="18"/>
-                <w:szCs w:val="18"/>
-              </w:rPr>
-              <w:t>catalogo</w:t>
-            </w:r>
-            <w:proofErr w:type="spellEnd"/>
-            <w:r>
-              <w:rPr>
-                <w:sz w:val="18"/>
-                <w:szCs w:val="18"/>
-              </w:rPr>
-              <w:t xml:space="preserve"> existente.</w:t>
-            </w:r>
-          </w:p>
-        </w:tc>
-        <w:tc>
-          <w:tcPr>
-            <w:tcW w:w="0" w:type="auto"/>
-            <w:tcBorders>
-              <w:top w:val="single" w:sz="6" w:space="0" w:color="C4C7C5"/>
-              <w:left w:val="single" w:sz="6" w:space="0" w:color="C4C7C5"/>
-              <w:bottom w:val="single" w:sz="6" w:space="0" w:color="C4C7C5"/>
-              <w:right w:val="single" w:sz="6" w:space="0" w:color="C4C7C5"/>
-            </w:tcBorders>
-            <w:tcMar>
-              <w:top w:w="120" w:type="dxa"/>
-              <w:left w:w="180" w:type="dxa"/>
-              <w:bottom w:w="120" w:type="dxa"/>
-              <w:right w:w="180" w:type="dxa"/>
-            </w:tcMar>
-            <w:vAlign w:val="center"/>
-            <w:hideMark/>
-          </w:tcPr>
-          <w:p>
-            <w:pPr>
-              <w:jc w:val="both"/>
-              <w:rPr>
-                <w:sz w:val="18"/>
-                <w:szCs w:val="18"/>
-                <w:lang w:val="en-US"/>
-              </w:rPr>
-            </w:pPr>
-            <w:r>
-              <w:rPr>
-                <w:sz w:val="18"/>
-                <w:szCs w:val="18"/>
-              </w:rPr>
-              <w:t xml:space="preserve"> </w:t>
-            </w:r>
-            <w:r>
-              <w:rPr>
-                <w:sz w:val="18"/>
-                <w:szCs w:val="18"/>
-              </w:rPr>
-              <w:t>% Valid non-</w:t>
-            </w:r>
-            <w:proofErr w:type="spellStart"/>
-            <w:r>
-              <w:rPr>
-                <w:sz w:val="18"/>
-                <w:szCs w:val="18"/>
-              </w:rPr>
-              <w:t>null</w:t>
-            </w:r>
-            <w:proofErr w:type="spellEnd"/>
-            <w:r>
-              <w:rPr>
-                <w:sz w:val="18"/>
-                <w:szCs w:val="18"/>
-              </w:rPr>
-              <w:t xml:space="preserve"> </w:t>
-            </w:r>
-            <w:proofErr w:type="spellStart"/>
-            <w:r>
-              <w:rPr>
-                <w:sz w:val="18"/>
-                <w:szCs w:val="18"/>
-              </w:rPr>
-              <w:t>records</w:t>
-            </w:r>
-            <w:proofErr w:type="spellEnd"/>
-          </w:p>
-        </w:tc>
-        <w:tc>
-          <w:tcPr>
-            <w:tcW w:w="0" w:type="auto"/>
-            <w:tcBorders>
-              <w:top w:val="single" w:sz="6" w:space="0" w:color="C4C7C5"/>
-              <w:left w:val="single" w:sz="6" w:space="0" w:color="C4C7C5"/>
-              <w:bottom w:val="single" w:sz="6" w:space="0" w:color="C4C7C5"/>
-              <w:right w:val="single" w:sz="6" w:space="0" w:color="C4C7C5"/>
-            </w:tcBorders>
-            <w:tcMar>
-              <w:top w:w="120" w:type="dxa"/>
-              <w:left w:w="180" w:type="dxa"/>
-              <w:bottom w:w="120" w:type="dxa"/>
-              <w:right w:w="180" w:type="dxa"/>
-            </w:tcMar>
-            <w:vAlign w:val="center"/>
-            <w:hideMark/>
-          </w:tcPr>
-          <w:p>
-            <w:pPr>
-              <w:jc w:val="both"/>
-            </w:pPr>
-            <w:r>
-              <w:t xml:space="preserve">&gt;= </w:t>
-            </w:r>
-            <w:r>
-              <w:t>9</w:t>
-            </w:r>
-            <w:r>
-              <w:t>8</w:t>
-            </w:r>
-            <w:r>
-              <w:t>%</w:t>
-            </w:r>
-          </w:p>
-        </w:tc>
-        <w:tc>
-          <w:tcPr>
-            <w:tcW w:w="0" w:type="auto"/>
-            <w:tcBorders>
-              <w:top w:val="single" w:sz="6" w:space="0" w:color="C4C7C5"/>
-              <w:left w:val="single" w:sz="6" w:space="0" w:color="C4C7C5"/>
-              <w:bottom w:val="single" w:sz="6" w:space="0" w:color="C4C7C5"/>
-              <w:right w:val="single" w:sz="6" w:space="0" w:color="C4C7C5"/>
-            </w:tcBorders>
-            <w:tcMar>
-              <w:top w:w="120" w:type="dxa"/>
-              <w:left w:w="180" w:type="dxa"/>
-              <w:bottom w:w="120" w:type="dxa"/>
-              <w:right w:w="180" w:type="dxa"/>
-            </w:tcMar>
-            <w:vAlign w:val="center"/>
-            <w:hideMark/>
-          </w:tcPr>
-          <w:p>
-            <w:pPr>
-              <w:jc w:val="both"/>
-            </w:pPr>
-            <w:proofErr w:type="spellStart"/>
+            </w:pPr>
             <w:r>
               <w:t>Critical</w:t>
             </w:r>
-            <w:proofErr w:type="spellEnd"/>
           </w:p>
         </w:tc>
       </w:tr>
@@ -2349,7 +1850,6 @@
                 <w:szCs w:val="18"/>
               </w:rPr>
             </w:pPr>
-            <w:proofErr w:type="spellStart"/>
             <w:r>
               <w:rPr>
                 <w:sz w:val="18"/>
@@ -2357,7 +1857,6 @@
               </w:rPr>
               <w:t>Track_name</w:t>
             </w:r>
-            <w:proofErr w:type="spellEnd"/>
           </w:p>
         </w:tc>
         <w:tc>
@@ -2460,7 +1959,6 @@
                 <w:szCs w:val="18"/>
               </w:rPr>
             </w:pPr>
-            <w:proofErr w:type="spellStart"/>
             <w:r>
               <w:rPr>
                 <w:sz w:val="18"/>
@@ -2468,35 +1966,33 @@
               </w:rPr>
               <w:t>Completeness</w:t>
             </w:r>
-            <w:proofErr w:type="spellEnd"/>
-          </w:p>
-        </w:tc>
-        <w:tc>
-          <w:tcPr>
-            <w:tcW w:w="0" w:type="auto"/>
-            <w:tcBorders>
-              <w:top w:val="single" w:sz="6" w:space="0" w:color="C4C7C5"/>
-              <w:left w:val="single" w:sz="6" w:space="0" w:color="C4C7C5"/>
-              <w:bottom w:val="single" w:sz="6" w:space="0" w:color="C4C7C5"/>
-              <w:right w:val="single" w:sz="6" w:space="0" w:color="C4C7C5"/>
-            </w:tcBorders>
-            <w:tcMar>
-              <w:top w:w="120" w:type="dxa"/>
-              <w:left w:w="180" w:type="dxa"/>
-              <w:bottom w:w="120" w:type="dxa"/>
-              <w:right w:w="180" w:type="dxa"/>
-            </w:tcMar>
-            <w:vAlign w:val="center"/>
-          </w:tcPr>
-          <w:p>
-            <w:pPr>
-              <w:jc w:val="both"/>
-              <w:rPr>
-                <w:sz w:val="18"/>
-                <w:szCs w:val="18"/>
-              </w:rPr>
-            </w:pPr>
-            <w:proofErr w:type="spellStart"/>
+          </w:p>
+        </w:tc>
+        <w:tc>
+          <w:tcPr>
+            <w:tcW w:w="0" w:type="auto"/>
+            <w:tcBorders>
+              <w:top w:val="single" w:sz="6" w:space="0" w:color="C4C7C5"/>
+              <w:left w:val="single" w:sz="6" w:space="0" w:color="C4C7C5"/>
+              <w:bottom w:val="single" w:sz="6" w:space="0" w:color="C4C7C5"/>
+              <w:right w:val="single" w:sz="6" w:space="0" w:color="C4C7C5"/>
+            </w:tcBorders>
+            <w:tcMar>
+              <w:top w:w="120" w:type="dxa"/>
+              <w:left w:w="180" w:type="dxa"/>
+              <w:bottom w:w="120" w:type="dxa"/>
+              <w:right w:w="180" w:type="dxa"/>
+            </w:tcMar>
+            <w:vAlign w:val="center"/>
+          </w:tcPr>
+          <w:p>
+            <w:pPr>
+              <w:jc w:val="both"/>
+              <w:rPr>
+                <w:sz w:val="18"/>
+                <w:szCs w:val="18"/>
+              </w:rPr>
+            </w:pPr>
             <w:r>
               <w:rPr>
                 <w:sz w:val="18"/>
@@ -2504,7 +2000,6 @@
               </w:rPr>
               <w:t>Track_name</w:t>
             </w:r>
-            <w:proofErr w:type="spellEnd"/>
             <w:r>
               <w:rPr>
                 <w:sz w:val="18"/>
@@ -2551,33 +2046,8 @@
                 <w:sz w:val="18"/>
                 <w:szCs w:val="18"/>
               </w:rPr>
-              <w:t>% Valid non-</w:t>
-            </w:r>
-            <w:proofErr w:type="spellStart"/>
-            <w:r>
-              <w:rPr>
-                <w:sz w:val="18"/>
-                <w:szCs w:val="18"/>
-              </w:rPr>
-              <w:t>null</w:t>
-            </w:r>
-            <w:proofErr w:type="spellEnd"/>
-            <w:r>
-              <w:rPr>
-                <w:sz w:val="18"/>
-                <w:szCs w:val="18"/>
-              </w:rPr>
-              <w:t xml:space="preserve"> </w:t>
-            </w:r>
-            <w:proofErr w:type="spellStart"/>
-            <w:r>
-              <w:rPr>
-                <w:sz w:val="18"/>
-                <w:szCs w:val="18"/>
-              </w:rPr>
-              <w:t>records</w:t>
-            </w:r>
-            <w:proofErr w:type="spellEnd"/>
+              <w:t>% Valid non-null records</w:t>
+            </w:r>
           </w:p>
         </w:tc>
         <w:tc>
@@ -2672,7 +2142,6 @@
                 <w:szCs w:val="18"/>
               </w:rPr>
             </w:pPr>
-            <w:proofErr w:type="spellStart"/>
             <w:r>
               <w:rPr>
                 <w:sz w:val="18"/>
@@ -2681,7 +2150,6 @@
               <w:lastRenderedPageBreak/>
               <w:t>Album_name</w:t>
             </w:r>
-            <w:proofErr w:type="spellEnd"/>
           </w:p>
         </w:tc>
         <w:tc>
@@ -2798,7 +2266,6 @@
                 <w:szCs w:val="18"/>
               </w:rPr>
             </w:pPr>
-            <w:proofErr w:type="spellStart"/>
             <w:r>
               <w:rPr>
                 <w:sz w:val="18"/>
@@ -2806,35 +2273,33 @@
               </w:rPr>
               <w:t>Completeness</w:t>
             </w:r>
-            <w:proofErr w:type="spellEnd"/>
-          </w:p>
-        </w:tc>
-        <w:tc>
-          <w:tcPr>
-            <w:tcW w:w="0" w:type="auto"/>
-            <w:tcBorders>
-              <w:top w:val="single" w:sz="6" w:space="0" w:color="C4C7C5"/>
-              <w:left w:val="single" w:sz="6" w:space="0" w:color="C4C7C5"/>
-              <w:bottom w:val="single" w:sz="6" w:space="0" w:color="C4C7C5"/>
-              <w:right w:val="single" w:sz="6" w:space="0" w:color="C4C7C5"/>
-            </w:tcBorders>
-            <w:tcMar>
-              <w:top w:w="120" w:type="dxa"/>
-              <w:left w:w="180" w:type="dxa"/>
-              <w:bottom w:w="120" w:type="dxa"/>
-              <w:right w:w="180" w:type="dxa"/>
-            </w:tcMar>
-            <w:vAlign w:val="center"/>
-          </w:tcPr>
-          <w:p>
-            <w:pPr>
-              <w:jc w:val="both"/>
-              <w:rPr>
-                <w:sz w:val="18"/>
-                <w:szCs w:val="18"/>
-              </w:rPr>
-            </w:pPr>
-            <w:proofErr w:type="spellStart"/>
+          </w:p>
+        </w:tc>
+        <w:tc>
+          <w:tcPr>
+            <w:tcW w:w="0" w:type="auto"/>
+            <w:tcBorders>
+              <w:top w:val="single" w:sz="6" w:space="0" w:color="C4C7C5"/>
+              <w:left w:val="single" w:sz="6" w:space="0" w:color="C4C7C5"/>
+              <w:bottom w:val="single" w:sz="6" w:space="0" w:color="C4C7C5"/>
+              <w:right w:val="single" w:sz="6" w:space="0" w:color="C4C7C5"/>
+            </w:tcBorders>
+            <w:tcMar>
+              <w:top w:w="120" w:type="dxa"/>
+              <w:left w:w="180" w:type="dxa"/>
+              <w:bottom w:w="120" w:type="dxa"/>
+              <w:right w:w="180" w:type="dxa"/>
+            </w:tcMar>
+            <w:vAlign w:val="center"/>
+          </w:tcPr>
+          <w:p>
+            <w:pPr>
+              <w:jc w:val="both"/>
+              <w:rPr>
+                <w:sz w:val="18"/>
+                <w:szCs w:val="18"/>
+              </w:rPr>
+            </w:pPr>
             <w:r>
               <w:rPr>
                 <w:sz w:val="18"/>
@@ -2842,7 +2307,6 @@
               </w:rPr>
               <w:t>Album_name</w:t>
             </w:r>
-            <w:proofErr w:type="spellEnd"/>
             <w:r>
               <w:rPr>
                 <w:sz w:val="18"/>
@@ -2889,33 +2353,8 @@
                 <w:sz w:val="18"/>
                 <w:szCs w:val="18"/>
               </w:rPr>
-              <w:t>% Valid non-</w:t>
-            </w:r>
-            <w:proofErr w:type="spellStart"/>
-            <w:r>
-              <w:rPr>
-                <w:sz w:val="18"/>
-                <w:szCs w:val="18"/>
-              </w:rPr>
-              <w:t>null</w:t>
-            </w:r>
-            <w:proofErr w:type="spellEnd"/>
-            <w:r>
-              <w:rPr>
-                <w:sz w:val="18"/>
-                <w:szCs w:val="18"/>
-              </w:rPr>
-              <w:t xml:space="preserve"> </w:t>
-            </w:r>
-            <w:proofErr w:type="spellStart"/>
-            <w:r>
-              <w:rPr>
-                <w:sz w:val="18"/>
-                <w:szCs w:val="18"/>
-              </w:rPr>
-              <w:t>records</w:t>
-            </w:r>
-            <w:proofErr w:type="spellEnd"/>
+              <w:t>% Valid non-null records</w:t>
+            </w:r>
           </w:p>
         </w:tc>
         <w:tc>
@@ -3118,7 +2557,6 @@
                 <w:szCs w:val="18"/>
               </w:rPr>
             </w:pPr>
-            <w:proofErr w:type="spellStart"/>
             <w:r>
               <w:rPr>
                 <w:sz w:val="18"/>
@@ -3126,72 +2564,46 @@
               </w:rPr>
               <w:t>Completeness</w:t>
             </w:r>
-            <w:proofErr w:type="spellEnd"/>
-            <w:r>
-              <w:rPr>
-                <w:sz w:val="18"/>
-                <w:szCs w:val="18"/>
-              </w:rPr>
-              <w:t xml:space="preserve"> &amp; </w:t>
-            </w:r>
-            <w:proofErr w:type="spellStart"/>
-            <w:r>
-              <w:rPr>
-                <w:sz w:val="18"/>
-                <w:szCs w:val="18"/>
-              </w:rPr>
-              <w:t>validity</w:t>
-            </w:r>
-            <w:proofErr w:type="spellEnd"/>
-          </w:p>
-        </w:tc>
-        <w:tc>
-          <w:tcPr>
-            <w:tcW w:w="0" w:type="auto"/>
-            <w:tcBorders>
-              <w:top w:val="single" w:sz="6" w:space="0" w:color="C4C7C5"/>
-              <w:left w:val="single" w:sz="6" w:space="0" w:color="C4C7C5"/>
-              <w:bottom w:val="single" w:sz="6" w:space="0" w:color="C4C7C5"/>
-              <w:right w:val="single" w:sz="6" w:space="0" w:color="C4C7C5"/>
-            </w:tcBorders>
-            <w:tcMar>
-              <w:top w:w="120" w:type="dxa"/>
-              <w:left w:w="180" w:type="dxa"/>
-              <w:bottom w:w="120" w:type="dxa"/>
-              <w:right w:w="180" w:type="dxa"/>
-            </w:tcMar>
-            <w:vAlign w:val="center"/>
-          </w:tcPr>
-          <w:p>
-            <w:pPr>
-              <w:jc w:val="both"/>
-              <w:rPr>
-                <w:sz w:val="18"/>
-                <w:szCs w:val="18"/>
-              </w:rPr>
-            </w:pPr>
-            <w:r>
-              <w:rPr>
-                <w:sz w:val="18"/>
-                <w:szCs w:val="18"/>
-              </w:rPr>
-              <w:t xml:space="preserve">El rango de valores de </w:t>
-            </w:r>
-            <w:proofErr w:type="spellStart"/>
-            <w:r>
-              <w:rPr>
-                <w:sz w:val="18"/>
-                <w:szCs w:val="18"/>
-              </w:rPr>
-              <w:t>explicit</w:t>
-            </w:r>
-            <w:proofErr w:type="spellEnd"/>
-            <w:r>
-              <w:rPr>
-                <w:sz w:val="18"/>
-                <w:szCs w:val="18"/>
-              </w:rPr>
-              <w:t xml:space="preserve"> puede ser True o False y esta variable debe presentarse </w:t>
+            <w:r>
+              <w:rPr>
+                <w:sz w:val="18"/>
+                <w:szCs w:val="18"/>
+              </w:rPr>
+              <w:t xml:space="preserve"> &amp; validity</w:t>
+            </w:r>
+          </w:p>
+        </w:tc>
+        <w:tc>
+          <w:tcPr>
+            <w:tcW w:w="0" w:type="auto"/>
+            <w:tcBorders>
+              <w:top w:val="single" w:sz="6" w:space="0" w:color="C4C7C5"/>
+              <w:left w:val="single" w:sz="6" w:space="0" w:color="C4C7C5"/>
+              <w:bottom w:val="single" w:sz="6" w:space="0" w:color="C4C7C5"/>
+              <w:right w:val="single" w:sz="6" w:space="0" w:color="C4C7C5"/>
+            </w:tcBorders>
+            <w:tcMar>
+              <w:top w:w="120" w:type="dxa"/>
+              <w:left w:w="180" w:type="dxa"/>
+              <w:bottom w:w="120" w:type="dxa"/>
+              <w:right w:w="180" w:type="dxa"/>
+            </w:tcMar>
+            <w:vAlign w:val="center"/>
+          </w:tcPr>
+          <w:p>
+            <w:pPr>
+              <w:jc w:val="both"/>
+              <w:rPr>
+                <w:sz w:val="18"/>
+                <w:szCs w:val="18"/>
+              </w:rPr>
+            </w:pPr>
+            <w:r>
+              <w:rPr>
+                <w:sz w:val="18"/>
+                <w:szCs w:val="18"/>
+              </w:rPr>
+              <w:t xml:space="preserve">El rango de valores de explicit puede ser True o False y esta variable debe presentarse </w:t>
             </w:r>
             <w:r>
               <w:rPr>
@@ -3232,33 +2644,8 @@
                 <w:sz w:val="18"/>
                 <w:szCs w:val="18"/>
               </w:rPr>
-              <w:t>% Valid non-</w:t>
-            </w:r>
-            <w:proofErr w:type="spellStart"/>
-            <w:r>
-              <w:rPr>
-                <w:sz w:val="18"/>
-                <w:szCs w:val="18"/>
-              </w:rPr>
-              <w:t>null</w:t>
-            </w:r>
-            <w:proofErr w:type="spellEnd"/>
-            <w:r>
-              <w:rPr>
-                <w:sz w:val="18"/>
-                <w:szCs w:val="18"/>
-              </w:rPr>
-              <w:t xml:space="preserve"> </w:t>
-            </w:r>
-            <w:proofErr w:type="spellStart"/>
-            <w:r>
-              <w:rPr>
-                <w:sz w:val="18"/>
-                <w:szCs w:val="18"/>
-              </w:rPr>
-              <w:t>records</w:t>
-            </w:r>
-            <w:proofErr w:type="spellEnd"/>
+              <w:t>% Valid non-null records</w:t>
+            </w:r>
           </w:p>
           <w:p>
             <w:pPr>
@@ -3530,7 +2917,6 @@
                 <w:szCs w:val="18"/>
               </w:rPr>
             </w:pPr>
-            <w:proofErr w:type="spellStart"/>
             <w:r>
               <w:rPr>
                 <w:sz w:val="18"/>
@@ -3545,7 +2931,6 @@
               </w:rPr>
               <w:t>alidity</w:t>
             </w:r>
-            <w:proofErr w:type="spellEnd"/>
           </w:p>
         </w:tc>
         <w:tc>
@@ -3633,23 +3018,7 @@
                 <w:sz w:val="18"/>
                 <w:szCs w:val="18"/>
               </w:rPr>
-              <w:t xml:space="preserve"> </w:t>
-            </w:r>
-            <w:proofErr w:type="spellStart"/>
-            <w:r>
-              <w:rPr>
-                <w:sz w:val="18"/>
-                <w:szCs w:val="18"/>
-              </w:rPr>
-              <w:t>energy</w:t>
-            </w:r>
-            <w:proofErr w:type="spellEnd"/>
-            <w:r>
-              <w:rPr>
-                <w:sz w:val="18"/>
-                <w:szCs w:val="18"/>
-              </w:rPr>
-              <w:t xml:space="preserve"> y verificar que no hayan valores negativos</w:t>
+              <w:t xml:space="preserve"> energy y verificar que no hayan valores negativos</w:t>
             </w:r>
           </w:p>
         </w:tc>
@@ -3706,11 +3075,9 @@
             <w:pPr>
               <w:jc w:val="both"/>
             </w:pPr>
-            <w:proofErr w:type="spellStart"/>
             <w:r>
               <w:t>Critical</w:t>
             </w:r>
-            <w:proofErr w:type="spellEnd"/>
           </w:p>
         </w:tc>
       </w:tr>
@@ -3867,7 +3234,6 @@
                 <w:szCs w:val="18"/>
               </w:rPr>
             </w:pPr>
-            <w:proofErr w:type="spellStart"/>
             <w:r>
               <w:rPr>
                 <w:sz w:val="18"/>
@@ -3875,49 +3241,39 @@
               </w:rPr>
               <w:t>Validity</w:t>
             </w:r>
-            <w:proofErr w:type="spellEnd"/>
-          </w:p>
-        </w:tc>
-        <w:tc>
-          <w:tcPr>
-            <w:tcW w:w="0" w:type="auto"/>
-            <w:tcBorders>
-              <w:top w:val="single" w:sz="6" w:space="0" w:color="C4C7C5"/>
-              <w:left w:val="single" w:sz="6" w:space="0" w:color="C4C7C5"/>
-              <w:bottom w:val="single" w:sz="6" w:space="0" w:color="C4C7C5"/>
-              <w:right w:val="single" w:sz="6" w:space="0" w:color="C4C7C5"/>
-            </w:tcBorders>
-            <w:tcMar>
-              <w:top w:w="120" w:type="dxa"/>
-              <w:left w:w="180" w:type="dxa"/>
-              <w:bottom w:w="120" w:type="dxa"/>
-              <w:right w:w="180" w:type="dxa"/>
-            </w:tcMar>
-            <w:vAlign w:val="center"/>
-          </w:tcPr>
-          <w:p>
-            <w:pPr>
-              <w:jc w:val="both"/>
-              <w:rPr>
-                <w:sz w:val="18"/>
-                <w:szCs w:val="18"/>
-              </w:rPr>
-            </w:pPr>
-            <w:proofErr w:type="spellStart"/>
-            <w:r>
-              <w:rPr>
-                <w:sz w:val="18"/>
-                <w:szCs w:val="18"/>
-              </w:rPr>
-              <w:t>Danceability</w:t>
-            </w:r>
-            <w:proofErr w:type="spellEnd"/>
-            <w:r>
-              <w:rPr>
-                <w:sz w:val="18"/>
-                <w:szCs w:val="18"/>
-              </w:rPr>
-              <w:t xml:space="preserve"> debe pertenecer a un rango entre 0 y 1</w:t>
+          </w:p>
+        </w:tc>
+        <w:tc>
+          <w:tcPr>
+            <w:tcW w:w="0" w:type="auto"/>
+            <w:tcBorders>
+              <w:top w:val="single" w:sz="6" w:space="0" w:color="C4C7C5"/>
+              <w:left w:val="single" w:sz="6" w:space="0" w:color="C4C7C5"/>
+              <w:bottom w:val="single" w:sz="6" w:space="0" w:color="C4C7C5"/>
+              <w:right w:val="single" w:sz="6" w:space="0" w:color="C4C7C5"/>
+            </w:tcBorders>
+            <w:tcMar>
+              <w:top w:w="120" w:type="dxa"/>
+              <w:left w:w="180" w:type="dxa"/>
+              <w:bottom w:w="120" w:type="dxa"/>
+              <w:right w:w="180" w:type="dxa"/>
+            </w:tcMar>
+            <w:vAlign w:val="center"/>
+          </w:tcPr>
+          <w:p>
+            <w:pPr>
+              <w:jc w:val="both"/>
+              <w:rPr>
+                <w:sz w:val="18"/>
+                <w:szCs w:val="18"/>
+              </w:rPr>
+            </w:pPr>
+            <w:r>
+              <w:rPr>
+                <w:sz w:val="18"/>
+                <w:szCs w:val="18"/>
+              </w:rPr>
+              <w:t>Danceability debe pertenecer a un rango entre 0 y 1</w:t>
             </w:r>
           </w:p>
         </w:tc>
@@ -3960,21 +3316,12 @@
               </w:rPr>
               <w:t xml:space="preserve"> </w:t>
             </w:r>
-            <w:proofErr w:type="spellStart"/>
-            <w:r>
-              <w:rPr>
-                <w:sz w:val="18"/>
-                <w:szCs w:val="18"/>
-              </w:rPr>
-              <w:t>danceability</w:t>
-            </w:r>
-            <w:proofErr w:type="spellEnd"/>
-            <w:r>
-              <w:rPr>
-                <w:sz w:val="18"/>
-                <w:szCs w:val="18"/>
-              </w:rPr>
-              <w:t xml:space="preserve"> y verificar que no </w:t>
+            <w:r>
+              <w:rPr>
+                <w:sz w:val="18"/>
+                <w:szCs w:val="18"/>
+              </w:rPr>
+              <w:t xml:space="preserve">danceability y verificar que no </w:t>
             </w:r>
             <w:r>
               <w:rPr>
@@ -4045,11 +3392,9 @@
             <w:pPr>
               <w:jc w:val="both"/>
             </w:pPr>
-            <w:proofErr w:type="spellStart"/>
             <w:r>
               <w:t>Critical</w:t>
             </w:r>
-            <w:proofErr w:type="spellEnd"/>
           </w:p>
         </w:tc>
       </w:tr>
@@ -4205,7 +3550,6 @@
                 <w:szCs w:val="18"/>
               </w:rPr>
             </w:pPr>
-            <w:proofErr w:type="spellStart"/>
             <w:r>
               <w:rPr>
                 <w:sz w:val="18"/>
@@ -4213,49 +3557,39 @@
               </w:rPr>
               <w:t>Validity</w:t>
             </w:r>
-            <w:proofErr w:type="spellEnd"/>
-          </w:p>
-        </w:tc>
-        <w:tc>
-          <w:tcPr>
-            <w:tcW w:w="0" w:type="auto"/>
-            <w:tcBorders>
-              <w:top w:val="single" w:sz="6" w:space="0" w:color="C4C7C5"/>
-              <w:left w:val="single" w:sz="6" w:space="0" w:color="C4C7C5"/>
-              <w:bottom w:val="single" w:sz="6" w:space="0" w:color="C4C7C5"/>
-              <w:right w:val="single" w:sz="6" w:space="0" w:color="C4C7C5"/>
-            </w:tcBorders>
-            <w:tcMar>
-              <w:top w:w="120" w:type="dxa"/>
-              <w:left w:w="180" w:type="dxa"/>
-              <w:bottom w:w="120" w:type="dxa"/>
-              <w:right w:w="180" w:type="dxa"/>
-            </w:tcMar>
-            <w:vAlign w:val="center"/>
-          </w:tcPr>
-          <w:p>
-            <w:pPr>
-              <w:jc w:val="both"/>
-              <w:rPr>
-                <w:sz w:val="18"/>
-                <w:szCs w:val="18"/>
-              </w:rPr>
-            </w:pPr>
-            <w:proofErr w:type="spellStart"/>
-            <w:r>
-              <w:rPr>
-                <w:sz w:val="18"/>
-                <w:szCs w:val="18"/>
-              </w:rPr>
-              <w:t>Popularity</w:t>
-            </w:r>
-            <w:proofErr w:type="spellEnd"/>
-            <w:r>
-              <w:rPr>
-                <w:sz w:val="18"/>
-                <w:szCs w:val="18"/>
-              </w:rPr>
-              <w:t xml:space="preserve"> debe pertenecer a un rango entre 0 y 100</w:t>
+          </w:p>
+        </w:tc>
+        <w:tc>
+          <w:tcPr>
+            <w:tcW w:w="0" w:type="auto"/>
+            <w:tcBorders>
+              <w:top w:val="single" w:sz="6" w:space="0" w:color="C4C7C5"/>
+              <w:left w:val="single" w:sz="6" w:space="0" w:color="C4C7C5"/>
+              <w:bottom w:val="single" w:sz="6" w:space="0" w:color="C4C7C5"/>
+              <w:right w:val="single" w:sz="6" w:space="0" w:color="C4C7C5"/>
+            </w:tcBorders>
+            <w:tcMar>
+              <w:top w:w="120" w:type="dxa"/>
+              <w:left w:w="180" w:type="dxa"/>
+              <w:bottom w:w="120" w:type="dxa"/>
+              <w:right w:w="180" w:type="dxa"/>
+            </w:tcMar>
+            <w:vAlign w:val="center"/>
+          </w:tcPr>
+          <w:p>
+            <w:pPr>
+              <w:jc w:val="both"/>
+              <w:rPr>
+                <w:sz w:val="18"/>
+                <w:szCs w:val="18"/>
+              </w:rPr>
+            </w:pPr>
+            <w:r>
+              <w:rPr>
+                <w:sz w:val="18"/>
+                <w:szCs w:val="18"/>
+              </w:rPr>
+              <w:t>Popularity debe pertenecer a un rango entre 0 y 100</w:t>
             </w:r>
           </w:p>
         </w:tc>
@@ -4362,11 +3696,9 @@
             <w:pPr>
               <w:jc w:val="both"/>
             </w:pPr>
-            <w:proofErr w:type="spellStart"/>
             <w:r>
               <w:t>Critical</w:t>
             </w:r>
-            <w:proofErr w:type="spellEnd"/>
           </w:p>
         </w:tc>
       </w:tr>
@@ -4399,14 +3731,12 @@
                 <w:lang w:val="en-US"/>
               </w:rPr>
             </w:pPr>
-            <w:proofErr w:type="spellStart"/>
             <w:r>
               <w:rPr>
                 <w:lang w:val="en-US"/>
               </w:rPr>
               <w:t>duration_ms</w:t>
             </w:r>
-            <w:proofErr w:type="spellEnd"/>
           </w:p>
         </w:tc>
         <w:tc>
@@ -4524,7 +3854,6 @@
                 <w:szCs w:val="18"/>
               </w:rPr>
             </w:pPr>
-            <w:proofErr w:type="spellStart"/>
             <w:r>
               <w:rPr>
                 <w:sz w:val="18"/>
@@ -4532,49 +3861,39 @@
               </w:rPr>
               <w:t>Validity</w:t>
             </w:r>
-            <w:proofErr w:type="spellEnd"/>
-          </w:p>
-        </w:tc>
-        <w:tc>
-          <w:tcPr>
-            <w:tcW w:w="0" w:type="auto"/>
-            <w:tcBorders>
-              <w:top w:val="single" w:sz="6" w:space="0" w:color="C4C7C5"/>
-              <w:left w:val="single" w:sz="6" w:space="0" w:color="C4C7C5"/>
-              <w:bottom w:val="single" w:sz="6" w:space="0" w:color="C4C7C5"/>
-              <w:right w:val="single" w:sz="6" w:space="0" w:color="C4C7C5"/>
-            </w:tcBorders>
-            <w:tcMar>
-              <w:top w:w="120" w:type="dxa"/>
-              <w:left w:w="180" w:type="dxa"/>
-              <w:bottom w:w="120" w:type="dxa"/>
-              <w:right w:w="180" w:type="dxa"/>
-            </w:tcMar>
-            <w:vAlign w:val="center"/>
-          </w:tcPr>
-          <w:p>
-            <w:pPr>
-              <w:jc w:val="both"/>
-              <w:rPr>
-                <w:sz w:val="18"/>
-                <w:szCs w:val="18"/>
-              </w:rPr>
-            </w:pPr>
-            <w:proofErr w:type="spellStart"/>
-            <w:r>
-              <w:rPr>
-                <w:sz w:val="18"/>
-                <w:szCs w:val="18"/>
-              </w:rPr>
-              <w:t>Duartions_ms</w:t>
-            </w:r>
-            <w:proofErr w:type="spellEnd"/>
-            <w:r>
-              <w:rPr>
-                <w:sz w:val="18"/>
-                <w:szCs w:val="18"/>
-              </w:rPr>
-              <w:t xml:space="preserve"> debe ser mayor que &gt;= 0 </w:t>
+          </w:p>
+        </w:tc>
+        <w:tc>
+          <w:tcPr>
+            <w:tcW w:w="0" w:type="auto"/>
+            <w:tcBorders>
+              <w:top w:val="single" w:sz="6" w:space="0" w:color="C4C7C5"/>
+              <w:left w:val="single" w:sz="6" w:space="0" w:color="C4C7C5"/>
+              <w:bottom w:val="single" w:sz="6" w:space="0" w:color="C4C7C5"/>
+              <w:right w:val="single" w:sz="6" w:space="0" w:color="C4C7C5"/>
+            </w:tcBorders>
+            <w:tcMar>
+              <w:top w:w="120" w:type="dxa"/>
+              <w:left w:w="180" w:type="dxa"/>
+              <w:bottom w:w="120" w:type="dxa"/>
+              <w:right w:w="180" w:type="dxa"/>
+            </w:tcMar>
+            <w:vAlign w:val="center"/>
+          </w:tcPr>
+          <w:p>
+            <w:pPr>
+              <w:jc w:val="both"/>
+              <w:rPr>
+                <w:sz w:val="18"/>
+                <w:szCs w:val="18"/>
+              </w:rPr>
+            </w:pPr>
+            <w:r>
+              <w:rPr>
+                <w:sz w:val="18"/>
+                <w:szCs w:val="18"/>
+              </w:rPr>
+              <w:t xml:space="preserve">Duartions_ms debe ser mayor que &gt;= 0 </w:t>
             </w:r>
           </w:p>
         </w:tc>
@@ -4659,13 +3978,8 @@
             <w:pPr>
               <w:jc w:val="both"/>
             </w:pPr>
-            <w:proofErr w:type="spellStart"/>
-            <w:r>
-              <w:t>Critical</w:t>
-            </w:r>
-            <w:proofErr w:type="spellEnd"/>
-            <w:r>
-              <w:t xml:space="preserve"> </w:t>
+            <w:r>
+              <w:t xml:space="preserve">Critical </w:t>
             </w:r>
           </w:p>
         </w:tc>
@@ -4699,14 +4013,12 @@
                 <w:lang w:val="en-US"/>
               </w:rPr>
             </w:pPr>
-            <w:proofErr w:type="spellStart"/>
             <w:r>
               <w:rPr>
                 <w:lang w:val="en-US"/>
               </w:rPr>
               <w:t>duration_ms</w:t>
             </w:r>
-            <w:proofErr w:type="spellEnd"/>
             <w:r>
               <w:rPr>
                 <w:lang w:val="en-US"/>
@@ -4837,7 +4149,6 @@
                 <w:szCs w:val="18"/>
               </w:rPr>
             </w:pPr>
-            <w:proofErr w:type="spellStart"/>
             <w:r>
               <w:rPr>
                 <w:sz w:val="18"/>
@@ -4845,49 +4156,39 @@
               </w:rPr>
               <w:t>Validity</w:t>
             </w:r>
-            <w:proofErr w:type="spellEnd"/>
-          </w:p>
-        </w:tc>
-        <w:tc>
-          <w:tcPr>
-            <w:tcW w:w="0" w:type="auto"/>
-            <w:tcBorders>
-              <w:top w:val="single" w:sz="6" w:space="0" w:color="C4C7C5"/>
-              <w:left w:val="single" w:sz="6" w:space="0" w:color="C4C7C5"/>
-              <w:bottom w:val="single" w:sz="6" w:space="0" w:color="C4C7C5"/>
-              <w:right w:val="single" w:sz="6" w:space="0" w:color="C4C7C5"/>
-            </w:tcBorders>
-            <w:tcMar>
-              <w:top w:w="120" w:type="dxa"/>
-              <w:left w:w="180" w:type="dxa"/>
-              <w:bottom w:w="120" w:type="dxa"/>
-              <w:right w:w="180" w:type="dxa"/>
-            </w:tcMar>
-            <w:vAlign w:val="center"/>
-          </w:tcPr>
-          <w:p>
-            <w:pPr>
-              <w:jc w:val="both"/>
-              <w:rPr>
-                <w:sz w:val="18"/>
-                <w:szCs w:val="18"/>
-              </w:rPr>
-            </w:pPr>
-            <w:proofErr w:type="spellStart"/>
-            <w:r>
-              <w:rPr>
-                <w:sz w:val="18"/>
-                <w:szCs w:val="18"/>
-              </w:rPr>
-              <w:t>Durations_ms</w:t>
-            </w:r>
-            <w:proofErr w:type="spellEnd"/>
-            <w:r>
-              <w:rPr>
-                <w:sz w:val="18"/>
-                <w:szCs w:val="18"/>
-              </w:rPr>
-              <w:t xml:space="preserve">  debe ser mayor que &gt;= 30000</w:t>
+          </w:p>
+        </w:tc>
+        <w:tc>
+          <w:tcPr>
+            <w:tcW w:w="0" w:type="auto"/>
+            <w:tcBorders>
+              <w:top w:val="single" w:sz="6" w:space="0" w:color="C4C7C5"/>
+              <w:left w:val="single" w:sz="6" w:space="0" w:color="C4C7C5"/>
+              <w:bottom w:val="single" w:sz="6" w:space="0" w:color="C4C7C5"/>
+              <w:right w:val="single" w:sz="6" w:space="0" w:color="C4C7C5"/>
+            </w:tcBorders>
+            <w:tcMar>
+              <w:top w:w="120" w:type="dxa"/>
+              <w:left w:w="180" w:type="dxa"/>
+              <w:bottom w:w="120" w:type="dxa"/>
+              <w:right w:w="180" w:type="dxa"/>
+            </w:tcMar>
+            <w:vAlign w:val="center"/>
+          </w:tcPr>
+          <w:p>
+            <w:pPr>
+              <w:jc w:val="both"/>
+              <w:rPr>
+                <w:sz w:val="18"/>
+                <w:szCs w:val="18"/>
+              </w:rPr>
+            </w:pPr>
+            <w:r>
+              <w:rPr>
+                <w:sz w:val="18"/>
+                <w:szCs w:val="18"/>
+              </w:rPr>
+              <w:t>Durations_ms  debe ser mayor que &gt;= 30000</w:t>
             </w:r>
           </w:p>
         </w:tc>
@@ -5012,7 +4313,6 @@
             <w:pPr>
               <w:jc w:val="center"/>
             </w:pPr>
-            <w:proofErr w:type="spellStart"/>
             <w:r>
               <w:rPr>
                 <w:b/>
@@ -5023,7 +4323,6 @@
               <w:lastRenderedPageBreak/>
               <w:t>Attribute</w:t>
             </w:r>
-            <w:proofErr w:type="spellEnd"/>
           </w:p>
         </w:tc>
         <w:tc>
@@ -5034,7 +4333,6 @@
             <w:pPr>
               <w:jc w:val="center"/>
             </w:pPr>
-            <w:proofErr w:type="spellStart"/>
             <w:r>
               <w:rPr>
                 <w:b/>
@@ -5042,9 +4340,18 @@
                 <w:sz w:val="18"/>
                 <w:szCs w:val="18"/>
               </w:rPr>
-              <w:t>Profiling</w:t>
-            </w:r>
-            <w:proofErr w:type="spellEnd"/>
+              <w:t>Profiling Evidence</w:t>
+            </w:r>
+          </w:p>
+        </w:tc>
+        <w:tc>
+          <w:tcPr>
+            <w:tcW w:w="1153" w:type="dxa"/>
+          </w:tcPr>
+          <w:p>
+            <w:pPr>
+              <w:jc w:val="center"/>
+            </w:pPr>
             <w:r>
               <w:rPr>
                 <w:b/>
@@ -5052,9 +4359,18 @@
                 <w:sz w:val="18"/>
                 <w:szCs w:val="18"/>
               </w:rPr>
-              <w:t xml:space="preserve"> </w:t>
-            </w:r>
-            <w:proofErr w:type="spellStart"/>
+              <w:t>Possible Quality Risk</w:t>
+            </w:r>
+          </w:p>
+        </w:tc>
+        <w:tc>
+          <w:tcPr>
+            <w:tcW w:w="1364" w:type="dxa"/>
+          </w:tcPr>
+          <w:p>
+            <w:pPr>
+              <w:jc w:val="center"/>
+            </w:pPr>
             <w:r>
               <w:rPr>
                 <w:b/>
@@ -5062,20 +4378,18 @@
                 <w:sz w:val="18"/>
                 <w:szCs w:val="18"/>
               </w:rPr>
-              <w:t>Evidence</w:t>
-            </w:r>
-            <w:proofErr w:type="spellEnd"/>
-          </w:p>
-        </w:tc>
-        <w:tc>
-          <w:tcPr>
-            <w:tcW w:w="1153" w:type="dxa"/>
+              <w:t>Quality Dimension</w:t>
+            </w:r>
+          </w:p>
+        </w:tc>
+        <w:tc>
+          <w:tcPr>
+            <w:tcW w:w="1131" w:type="dxa"/>
           </w:tcPr>
           <w:p>
             <w:pPr>
               <w:jc w:val="center"/>
             </w:pPr>
-            <w:proofErr w:type="spellStart"/>
             <w:r>
               <w:rPr>
                 <w:b/>
@@ -5083,9 +4397,18 @@
                 <w:sz w:val="18"/>
                 <w:szCs w:val="18"/>
               </w:rPr>
-              <w:t>Possible</w:t>
-            </w:r>
-            <w:proofErr w:type="spellEnd"/>
+              <w:t>Quality Rule</w:t>
+            </w:r>
+          </w:p>
+        </w:tc>
+        <w:tc>
+          <w:tcPr>
+            <w:tcW w:w="1125" w:type="dxa"/>
+          </w:tcPr>
+          <w:p>
+            <w:pPr>
+              <w:jc w:val="center"/>
+            </w:pPr>
             <w:r>
               <w:rPr>
                 <w:b/>
@@ -5093,156 +4416,40 @@
                 <w:sz w:val="18"/>
                 <w:szCs w:val="18"/>
               </w:rPr>
-              <w:t xml:space="preserve"> </w:t>
-            </w:r>
-            <w:proofErr w:type="spellStart"/>
+              <w:t>Metric</w:t>
+            </w:r>
+          </w:p>
+        </w:tc>
+        <w:tc>
+          <w:tcPr>
+            <w:tcW w:w="1276" w:type="dxa"/>
+          </w:tcPr>
+          <w:p>
+            <w:pPr>
+              <w:jc w:val="center"/>
+            </w:pPr>
             <w:r>
               <w:rPr>
                 <w:b/>
                 <w:bCs/>
-                <w:sz w:val="18"/>
-                <w:szCs w:val="18"/>
-              </w:rPr>
-              <w:t>Quality</w:t>
-            </w:r>
-            <w:proofErr w:type="spellEnd"/>
+              </w:rPr>
+              <w:t>Threshold</w:t>
+            </w:r>
+          </w:p>
+        </w:tc>
+        <w:tc>
+          <w:tcPr>
+            <w:tcW w:w="1093" w:type="dxa"/>
+            <w:vAlign w:val="center"/>
+          </w:tcPr>
+          <w:p>
             <w:r>
               <w:rPr>
                 <w:b/>
                 <w:bCs/>
-                <w:sz w:val="18"/>
-                <w:szCs w:val="18"/>
-              </w:rPr>
-              <w:t xml:space="preserve"> Risk</w:t>
-            </w:r>
-          </w:p>
-        </w:tc>
-        <w:tc>
-          <w:tcPr>
-            <w:tcW w:w="1364" w:type="dxa"/>
-          </w:tcPr>
-          <w:p>
-            <w:pPr>
-              <w:jc w:val="center"/>
-            </w:pPr>
-            <w:proofErr w:type="spellStart"/>
-            <w:r>
-              <w:rPr>
-                <w:b/>
-                <w:bCs/>
-                <w:sz w:val="18"/>
-                <w:szCs w:val="18"/>
-              </w:rPr>
-              <w:t>Quality</w:t>
-            </w:r>
-            <w:proofErr w:type="spellEnd"/>
-            <w:r>
-              <w:rPr>
-                <w:b/>
-                <w:bCs/>
-                <w:sz w:val="18"/>
-                <w:szCs w:val="18"/>
-              </w:rPr>
-              <w:t xml:space="preserve"> </w:t>
-            </w:r>
-            <w:proofErr w:type="spellStart"/>
-            <w:r>
-              <w:rPr>
-                <w:b/>
-                <w:bCs/>
-                <w:sz w:val="18"/>
-                <w:szCs w:val="18"/>
-              </w:rPr>
-              <w:t>Dimension</w:t>
-            </w:r>
-            <w:proofErr w:type="spellEnd"/>
-          </w:p>
-        </w:tc>
-        <w:tc>
-          <w:tcPr>
-            <w:tcW w:w="1131" w:type="dxa"/>
-          </w:tcPr>
-          <w:p>
-            <w:pPr>
-              <w:jc w:val="center"/>
-            </w:pPr>
-            <w:proofErr w:type="spellStart"/>
-            <w:r>
-              <w:rPr>
-                <w:b/>
-                <w:bCs/>
-                <w:sz w:val="18"/>
-                <w:szCs w:val="18"/>
-              </w:rPr>
-              <w:t>Quality</w:t>
-            </w:r>
-            <w:proofErr w:type="spellEnd"/>
-            <w:r>
-              <w:rPr>
-                <w:b/>
-                <w:bCs/>
-                <w:sz w:val="18"/>
-                <w:szCs w:val="18"/>
-              </w:rPr>
-              <w:t xml:space="preserve"> Rule</w:t>
-            </w:r>
-          </w:p>
-        </w:tc>
-        <w:tc>
-          <w:tcPr>
-            <w:tcW w:w="1125" w:type="dxa"/>
-          </w:tcPr>
-          <w:p>
-            <w:pPr>
-              <w:jc w:val="center"/>
-            </w:pPr>
-            <w:proofErr w:type="spellStart"/>
-            <w:r>
-              <w:rPr>
-                <w:b/>
-                <w:bCs/>
-                <w:sz w:val="18"/>
-                <w:szCs w:val="18"/>
-              </w:rPr>
-              <w:t>Metric</w:t>
-            </w:r>
-            <w:proofErr w:type="spellEnd"/>
-          </w:p>
-        </w:tc>
-        <w:tc>
-          <w:tcPr>
-            <w:tcW w:w="1276" w:type="dxa"/>
-          </w:tcPr>
-          <w:p>
-            <w:pPr>
-              <w:jc w:val="center"/>
-            </w:pPr>
-            <w:proofErr w:type="spellStart"/>
-            <w:r>
-              <w:rPr>
-                <w:b/>
-                <w:bCs/>
-              </w:rPr>
-              <w:t>Threshold</w:t>
-            </w:r>
-            <w:proofErr w:type="spellEnd"/>
-          </w:p>
-        </w:tc>
-        <w:tc>
-          <w:tcPr>
-            <w:tcW w:w="1093" w:type="dxa"/>
-            <w:vAlign w:val="center"/>
-          </w:tcPr>
-          <w:p>
-            <w:proofErr w:type="spellStart"/>
-            <w:r>
-              <w:rPr>
-                <w:b/>
-                <w:bCs/>
               </w:rPr>
               <w:t>Severity</w:t>
             </w:r>
-            <w:proofErr w:type="spellEnd"/>
           </w:p>
         </w:tc>
       </w:tr>
@@ -5279,11 +4486,9 @@
             <w:r>
               <w:t xml:space="preserve"> </w:t>
             </w:r>
-            <w:proofErr w:type="spellStart"/>
             <w:r>
               <w:t>year</w:t>
             </w:r>
-            <w:proofErr w:type="spellEnd"/>
           </w:p>
         </w:tc>
         <w:tc>
@@ -5361,14 +4566,12 @@
               </w:rPr>
               <w:t xml:space="preserve">  </w:t>
             </w:r>
-            <w:proofErr w:type="spellStart"/>
             <w:r>
               <w:rPr>
                 <w:rFonts w:ascii="Arial" w:hAnsi="Arial" w:cs="Arial"/>
               </w:rPr>
               <w:t>Validity</w:t>
             </w:r>
-            <w:proofErr w:type="spellEnd"/>
           </w:p>
         </w:tc>
         <w:tc>
@@ -5376,7 +4579,6 @@
             <w:tcW w:w="1131" w:type="dxa"/>
           </w:tcPr>
           <w:p>
-            <w:proofErr w:type="spellStart"/>
             <w:r>
               <w:t>y</w:t>
             </w:r>
@@ -5384,11 +4586,7 @@
               <w:t>ea</w:t>
             </w:r>
             <w:r>
-              <w:t>r</w:t>
-            </w:r>
-            <w:proofErr w:type="spellEnd"/>
-            <w:r>
-              <w:t>, debe ser m</w:t>
+              <w:t>r, debe ser m</w:t>
             </w:r>
             <w:r>
               <w:t xml:space="preserve">ayor que se </w:t>
@@ -5475,15 +4673,7 @@
               <w:jc w:val="both"/>
             </w:pPr>
             <w:r>
-              <w:t xml:space="preserve">  </w:t>
-            </w:r>
-            <w:proofErr w:type="spellStart"/>
-            <w:r>
-              <w:t>Critical</w:t>
-            </w:r>
-            <w:proofErr w:type="spellEnd"/>
-            <w:r>
-              <w:t xml:space="preserve"> </w:t>
+              <w:t xml:space="preserve">  Critical </w:t>
             </w:r>
           </w:p>
         </w:tc>
@@ -5524,13 +4714,8 @@
             <w:r>
               <w:t xml:space="preserve">   </w:t>
             </w:r>
-            <w:proofErr w:type="spellStart"/>
-            <w:r>
-              <w:t>Year</w:t>
-            </w:r>
-            <w:proofErr w:type="spellEnd"/>
-            <w:r>
-              <w:t xml:space="preserve"> </w:t>
+            <w:r>
+              <w:t xml:space="preserve">Year </w:t>
             </w:r>
           </w:p>
         </w:tc>
@@ -5606,14 +4791,12 @@
               </w:rPr>
               <w:t xml:space="preserve">  </w:t>
             </w:r>
-            <w:proofErr w:type="spellStart"/>
             <w:r>
               <w:rPr>
                 <w:rFonts w:ascii="Arial" w:hAnsi="Arial" w:cs="Arial"/>
               </w:rPr>
               <w:t>Validity</w:t>
             </w:r>
-            <w:proofErr w:type="spellEnd"/>
           </w:p>
         </w:tc>
         <w:tc>
@@ -5624,13 +4807,8 @@
             <w:pPr>
               <w:jc w:val="both"/>
             </w:pPr>
-            <w:proofErr w:type="spellStart"/>
-            <w:r>
-              <w:t>Year</w:t>
-            </w:r>
-            <w:proofErr w:type="spellEnd"/>
-            <w:r>
-              <w:t>, debe estar en el rango [1958-2019]</w:t>
+            <w:r>
+              <w:t>Year, debe estar en el rango [1958-2019]</w:t>
             </w:r>
           </w:p>
         </w:tc>
@@ -5699,13 +4877,8 @@
               <w:jc w:val="both"/>
             </w:pPr>
             <w:r>
-              <w:t xml:space="preserve"> </w:t>
-            </w:r>
-            <w:proofErr w:type="spellStart"/>
-            <w:r>
-              <w:t>Critical</w:t>
-            </w:r>
-            <w:proofErr w:type="spellEnd"/>
+              <w:t xml:space="preserve"> Critical</w:t>
+            </w:r>
           </w:p>
         </w:tc>
       </w:tr>
@@ -5727,97 +4900,85 @@
               <w:jc w:val="both"/>
             </w:pPr>
             <w:r>
-              <w:t xml:space="preserve">  </w:t>
-            </w:r>
-            <w:proofErr w:type="spellStart"/>
-            <w:r>
+              <w:t xml:space="preserve">  Category </w:t>
+            </w:r>
+          </w:p>
+        </w:tc>
+        <w:tc>
+          <w:tcPr>
+            <w:tcW w:w="1129" w:type="dxa"/>
+          </w:tcPr>
+          <w:p>
+            <w:pPr>
+              <w:jc w:val="both"/>
+            </w:pPr>
+            <w:r>
+              <w:t xml:space="preserve">0 valores nulos, 638 valores distintos </w:t>
+            </w:r>
+          </w:p>
+        </w:tc>
+        <w:tc>
+          <w:tcPr>
+            <w:tcW w:w="1153" w:type="dxa"/>
+          </w:tcPr>
+          <w:p>
+            <w:pPr>
+              <w:jc w:val="both"/>
+            </w:pPr>
+            <w:r>
+              <w:t xml:space="preserve">Valores nulos pueden llegar a afectar el análisis </w:t>
+            </w:r>
+          </w:p>
+        </w:tc>
+        <w:tc>
+          <w:tcPr>
+            <w:tcW w:w="1364" w:type="dxa"/>
+          </w:tcPr>
+          <w:p>
+            <w:pPr>
+              <w:jc w:val="both"/>
+            </w:pPr>
+            <w:r>
+              <w:t xml:space="preserve"> </w:t>
+            </w:r>
+          </w:p>
+          <w:p>
+            <w:pPr>
+              <w:jc w:val="both"/>
+              <w:rPr>
+                <w:sz w:val="18"/>
+                <w:szCs w:val="18"/>
+              </w:rPr>
+            </w:pPr>
+          </w:p>
+          <w:p>
+            <w:pPr>
+              <w:jc w:val="both"/>
+            </w:pPr>
+            <w:r>
+              <w:rPr>
+                <w:sz w:val="18"/>
+                <w:szCs w:val="18"/>
+              </w:rPr>
+              <w:t>Completeness</w:t>
+            </w:r>
+          </w:p>
+        </w:tc>
+        <w:tc>
+          <w:tcPr>
+            <w:tcW w:w="1131" w:type="dxa"/>
+          </w:tcPr>
+          <w:p>
+            <w:pPr>
+              <w:jc w:val="both"/>
+            </w:pPr>
+            <w:r>
+              <w:rPr>
+                <w:sz w:val="18"/>
+                <w:szCs w:val="18"/>
+              </w:rPr>
               <w:t>Category</w:t>
             </w:r>
-            <w:proofErr w:type="spellEnd"/>
-            <w:r>
-              <w:t xml:space="preserve"> </w:t>
-            </w:r>
-          </w:p>
-        </w:tc>
-        <w:tc>
-          <w:tcPr>
-            <w:tcW w:w="1129" w:type="dxa"/>
-          </w:tcPr>
-          <w:p>
-            <w:pPr>
-              <w:jc w:val="both"/>
-            </w:pPr>
-            <w:r>
-              <w:t xml:space="preserve">0 valores nulos, 638 valores distintos </w:t>
-            </w:r>
-          </w:p>
-        </w:tc>
-        <w:tc>
-          <w:tcPr>
-            <w:tcW w:w="1153" w:type="dxa"/>
-          </w:tcPr>
-          <w:p>
-            <w:pPr>
-              <w:jc w:val="both"/>
-            </w:pPr>
-            <w:r>
-              <w:t xml:space="preserve">Valores nulos pueden llegar a afectar el análisis </w:t>
-            </w:r>
-          </w:p>
-        </w:tc>
-        <w:tc>
-          <w:tcPr>
-            <w:tcW w:w="1364" w:type="dxa"/>
-          </w:tcPr>
-          <w:p>
-            <w:pPr>
-              <w:jc w:val="both"/>
-            </w:pPr>
-            <w:r>
-              <w:t xml:space="preserve"> </w:t>
-            </w:r>
-          </w:p>
-          <w:p>
-            <w:pPr>
-              <w:jc w:val="both"/>
-              <w:rPr>
-                <w:sz w:val="18"/>
-                <w:szCs w:val="18"/>
-              </w:rPr>
-            </w:pPr>
-          </w:p>
-          <w:p>
-            <w:pPr>
-              <w:jc w:val="both"/>
-            </w:pPr>
-            <w:proofErr w:type="spellStart"/>
-            <w:r>
-              <w:rPr>
-                <w:sz w:val="18"/>
-                <w:szCs w:val="18"/>
-              </w:rPr>
-              <w:t>Completeness</w:t>
-            </w:r>
-            <w:proofErr w:type="spellEnd"/>
-          </w:p>
-        </w:tc>
-        <w:tc>
-          <w:tcPr>
-            <w:tcW w:w="1131" w:type="dxa"/>
-          </w:tcPr>
-          <w:p>
-            <w:pPr>
-              <w:jc w:val="both"/>
-            </w:pPr>
-            <w:proofErr w:type="spellStart"/>
-            <w:r>
-              <w:rPr>
-                <w:sz w:val="18"/>
-                <w:szCs w:val="18"/>
-              </w:rPr>
-              <w:t>Category</w:t>
-            </w:r>
-            <w:proofErr w:type="spellEnd"/>
             <w:r>
               <w:rPr>
                 <w:sz w:val="14"/>
@@ -5855,33 +5016,8 @@
                 <w:sz w:val="18"/>
                 <w:szCs w:val="18"/>
               </w:rPr>
-              <w:t>% Valid non-</w:t>
-            </w:r>
-            <w:proofErr w:type="spellStart"/>
-            <w:r>
-              <w:rPr>
-                <w:sz w:val="18"/>
-                <w:szCs w:val="18"/>
-              </w:rPr>
-              <w:t>null</w:t>
-            </w:r>
-            <w:proofErr w:type="spellEnd"/>
-            <w:r>
-              <w:rPr>
-                <w:sz w:val="18"/>
-                <w:szCs w:val="18"/>
-              </w:rPr>
-              <w:t xml:space="preserve"> </w:t>
-            </w:r>
-            <w:proofErr w:type="spellStart"/>
-            <w:r>
-              <w:rPr>
-                <w:sz w:val="18"/>
-                <w:szCs w:val="18"/>
-              </w:rPr>
-              <w:t>records</w:t>
-            </w:r>
-            <w:proofErr w:type="spellEnd"/>
+              <w:t>% Valid non-null records</w:t>
+            </w:r>
           </w:p>
         </w:tc>
         <w:tc>
@@ -5925,11 +5061,9 @@
             <w:pPr>
               <w:jc w:val="both"/>
             </w:pPr>
-            <w:proofErr w:type="spellStart"/>
             <w:r>
               <w:t>Critical</w:t>
             </w:r>
-            <w:proofErr w:type="spellEnd"/>
           </w:p>
         </w:tc>
       </w:tr>
@@ -5960,11 +5094,9 @@
             <w:pPr>
               <w:jc w:val="center"/>
             </w:pPr>
-            <w:proofErr w:type="spellStart"/>
             <w:r>
               <w:t>nominee</w:t>
             </w:r>
-            <w:proofErr w:type="spellEnd"/>
           </w:p>
           <w:p/>
           <w:p>
@@ -6023,7 +5155,6 @@
             <w:pPr>
               <w:jc w:val="center"/>
             </w:pPr>
-            <w:proofErr w:type="spellStart"/>
             <w:r>
               <w:rPr>
                 <w:sz w:val="18"/>
@@ -6031,7 +5162,6 @@
               </w:rPr>
               <w:t>Completeness</w:t>
             </w:r>
-            <w:proofErr w:type="spellEnd"/>
           </w:p>
         </w:tc>
         <w:tc>
@@ -6046,7 +5176,6 @@
                 <w:szCs w:val="18"/>
               </w:rPr>
             </w:pPr>
-            <w:proofErr w:type="spellStart"/>
             <w:r>
               <w:rPr>
                 <w:sz w:val="18"/>
@@ -6054,7 +5183,6 @@
               </w:rPr>
               <w:t>nominee</w:t>
             </w:r>
-            <w:proofErr w:type="spellEnd"/>
           </w:p>
           <w:p>
             <w:pPr>
@@ -6098,33 +5226,8 @@
                 <w:sz w:val="18"/>
                 <w:szCs w:val="18"/>
               </w:rPr>
-              <w:t>% Valid non-</w:t>
-            </w:r>
-            <w:proofErr w:type="spellStart"/>
-            <w:r>
-              <w:rPr>
-                <w:sz w:val="18"/>
-                <w:szCs w:val="18"/>
-              </w:rPr>
-              <w:t>null</w:t>
-            </w:r>
-            <w:proofErr w:type="spellEnd"/>
-            <w:r>
-              <w:rPr>
-                <w:sz w:val="18"/>
-                <w:szCs w:val="18"/>
-              </w:rPr>
-              <w:t xml:space="preserve"> </w:t>
-            </w:r>
-            <w:proofErr w:type="spellStart"/>
-            <w:r>
-              <w:rPr>
-                <w:sz w:val="18"/>
-                <w:szCs w:val="18"/>
-              </w:rPr>
-              <w:t>records</w:t>
-            </w:r>
-            <w:proofErr w:type="spellEnd"/>
+              <w:t>% Valid non-null records</w:t>
+            </w:r>
           </w:p>
         </w:tc>
         <w:tc>
@@ -6178,11 +5281,9 @@
             <w:pPr>
               <w:jc w:val="center"/>
             </w:pPr>
-            <w:proofErr w:type="spellStart"/>
             <w:r>
               <w:t>Critical</w:t>
             </w:r>
-            <w:proofErr w:type="spellEnd"/>
           </w:p>
         </w:tc>
       </w:tr>
@@ -6267,11 +5368,9 @@
             <w:pPr>
               <w:jc w:val="both"/>
             </w:pPr>
-            <w:proofErr w:type="spellStart"/>
             <w:r>
               <w:t>Dim_album</w:t>
             </w:r>
-            <w:proofErr w:type="spellEnd"/>
             <w:r>
               <w:t xml:space="preserve"> </w:t>
             </w:r>
@@ -6288,56 +5387,24 @@
                 <w:lang w:val="en-US"/>
               </w:rPr>
             </w:pPr>
-            <w:proofErr w:type="spellStart"/>
             <w:r>
               <w:rPr>
                 <w:lang w:val="en-US"/>
               </w:rPr>
               <w:t>album_key</w:t>
             </w:r>
-            <w:proofErr w:type="spellEnd"/>
             <w:r>
               <w:rPr>
                 <w:lang w:val="en-US"/>
               </w:rPr>
-              <w:t xml:space="preserve">, </w:t>
-            </w:r>
-            <w:proofErr w:type="spellStart"/>
+              <w:t>, album_name</w:t>
+            </w:r>
             <w:r>
               <w:rPr>
                 <w:lang w:val="en-US"/>
               </w:rPr>
-              <w:t>album_name</w:t>
-            </w:r>
-            <w:proofErr w:type="spellEnd"/>
-            <w:r>
-              <w:rPr>
-                <w:lang w:val="en-US"/>
-              </w:rPr>
-              <w:t xml:space="preserve">, </w:t>
-            </w:r>
-            <w:proofErr w:type="spellStart"/>
-            <w:r>
-              <w:rPr>
-                <w:lang w:val="en-US"/>
-              </w:rPr>
-              <w:t>main_artist</w:t>
-            </w:r>
-            <w:proofErr w:type="spellEnd"/>
-            <w:r>
-              <w:rPr>
-                <w:lang w:val="en-US"/>
-              </w:rPr>
-              <w:t xml:space="preserve">, UK </w:t>
-            </w:r>
-            <w:proofErr w:type="spellStart"/>
-            <w:r>
-              <w:rPr>
-                <w:lang w:val="en-US"/>
-              </w:rPr>
-              <w:t>compuesta</w:t>
-            </w:r>
-            <w:proofErr w:type="spellEnd"/>
+              <w:t>, main_artist, UK compuesta</w:t>
+            </w:r>
           </w:p>
         </w:tc>
         <w:tc>
@@ -6362,15 +5429,7 @@
               <w:t xml:space="preserve"> de este</w:t>
             </w:r>
             <w:r>
-              <w:t xml:space="preserve"> y esto también porque en un </w:t>
-            </w:r>
-            <w:proofErr w:type="spellStart"/>
-            <w:r>
-              <w:t>album</w:t>
-            </w:r>
-            <w:proofErr w:type="spellEnd"/>
-            <w:r>
-              <w:t xml:space="preserve"> pueden haber una o muchas canciones.</w:t>
+              <w:t xml:space="preserve"> y esto también porque en un album pueden haber una o muchas canciones.</w:t>
             </w:r>
           </w:p>
         </w:tc>
@@ -6384,12 +5443,10 @@
             <w:pPr>
               <w:jc w:val="both"/>
             </w:pPr>
-            <w:proofErr w:type="spellStart"/>
             <w:r>
               <w:lastRenderedPageBreak/>
               <w:t>dim_track</w:t>
             </w:r>
-            <w:proofErr w:type="spellEnd"/>
           </w:p>
         </w:tc>
         <w:tc>
@@ -6403,40 +5460,24 @@
                 <w:lang w:val="en-US"/>
               </w:rPr>
             </w:pPr>
-            <w:proofErr w:type="spellStart"/>
             <w:r>
               <w:rPr>
                 <w:lang w:val="en-US"/>
               </w:rPr>
-              <w:t>track_name</w:t>
-            </w:r>
-            <w:proofErr w:type="spellEnd"/>
+              <w:t>track_name, track_</w:t>
+            </w:r>
             <w:r>
               <w:rPr>
                 <w:lang w:val="en-US"/>
               </w:rPr>
-              <w:t xml:space="preserve">, </w:t>
-            </w:r>
-            <w:proofErr w:type="spellStart"/>
+              <w:t>id</w:t>
+            </w:r>
             <w:r>
               <w:rPr>
                 <w:lang w:val="en-US"/>
               </w:rPr>
-              <w:t>track_</w:t>
-            </w:r>
-            <w:r>
-              <w:rPr>
-                <w:lang w:val="en-US"/>
-              </w:rPr>
-              <w:t>id</w:t>
-            </w:r>
-            <w:r>
-              <w:rPr>
-                <w:lang w:val="en-US"/>
-              </w:rPr>
               <w:t>,track_key</w:t>
             </w:r>
-            <w:proofErr w:type="spellEnd"/>
           </w:p>
         </w:tc>
         <w:tc>
@@ -6448,15 +5489,7 @@
               <w:jc w:val="both"/>
             </w:pPr>
             <w:r>
-              <w:t xml:space="preserve">Estas son las </w:t>
-            </w:r>
-            <w:proofErr w:type="spellStart"/>
-            <w:r>
-              <w:t>las</w:t>
-            </w:r>
-            <w:proofErr w:type="spellEnd"/>
-            <w:r>
-              <w:t xml:space="preserve"> </w:t>
+              <w:t xml:space="preserve">Estas son las las </w:t>
             </w:r>
             <w:r>
               <w:t>características que pertenecen a la canción</w:t>
@@ -6473,11 +5506,9 @@
             <w:pPr>
               <w:jc w:val="both"/>
             </w:pPr>
-            <w:proofErr w:type="spellStart"/>
             <w:r>
               <w:t>dim_genre</w:t>
             </w:r>
-            <w:proofErr w:type="spellEnd"/>
           </w:p>
         </w:tc>
         <w:tc>
@@ -6491,7 +5522,6 @@
                 <w:lang w:val="en-US"/>
               </w:rPr>
             </w:pPr>
-            <w:proofErr w:type="spellStart"/>
             <w:r>
               <w:rPr>
                 <w:lang w:val="en-US"/>
@@ -6510,27 +5540,18 @@
               </w:rPr>
               <w:t>_key</w:t>
             </w:r>
-            <w:proofErr w:type="spellEnd"/>
             <w:r>
               <w:rPr>
                 <w:lang w:val="en-US"/>
               </w:rPr>
-              <w:t xml:space="preserve">, </w:t>
-            </w:r>
-            <w:proofErr w:type="spellStart"/>
+              <w:t>, track</w:t>
+            </w:r>
             <w:r>
               <w:rPr>
                 <w:lang w:val="en-US"/>
               </w:rPr>
-              <w:t>track</w:t>
-            </w:r>
-            <w:r>
-              <w:rPr>
-                <w:lang w:val="en-US"/>
-              </w:rPr>
               <w:t>_genre</w:t>
             </w:r>
-            <w:proofErr w:type="spellEnd"/>
           </w:p>
         </w:tc>
         <w:tc>
@@ -6556,13 +5577,8 @@
             <w:pPr>
               <w:jc w:val="both"/>
             </w:pPr>
-            <w:proofErr w:type="spellStart"/>
-            <w:r>
-              <w:t>dim_artists</w:t>
-            </w:r>
-            <w:proofErr w:type="spellEnd"/>
-            <w:r>
-              <w:t xml:space="preserve"> </w:t>
+            <w:r>
+              <w:t xml:space="preserve">dim_artists </w:t>
             </w:r>
           </w:p>
         </w:tc>
@@ -6577,7 +5593,6 @@
                 <w:lang w:val="en-US"/>
               </w:rPr>
             </w:pPr>
-            <w:proofErr w:type="spellStart"/>
             <w:r>
               <w:rPr>
                 <w:lang w:val="en-US"/>
@@ -6596,7 +5611,6 @@
               </w:rPr>
               <w:t>_key</w:t>
             </w:r>
-            <w:proofErr w:type="spellEnd"/>
             <w:r>
               <w:rPr>
                 <w:lang w:val="en-US"/>
@@ -6642,13 +5656,8 @@
             <w:pPr>
               <w:jc w:val="both"/>
             </w:pPr>
-            <w:proofErr w:type="spellStart"/>
-            <w:r>
-              <w:t>Fact</w:t>
-            </w:r>
-            <w:proofErr w:type="spellEnd"/>
-            <w:r>
-              <w:t xml:space="preserve"> table</w:t>
+            <w:r>
+              <w:t>Fact table</w:t>
             </w:r>
           </w:p>
         </w:tc>
@@ -6685,14 +5694,76 @@
             <w:pPr>
               <w:jc w:val="both"/>
             </w:pPr>
-            <w:proofErr w:type="spellStart"/>
-            <w:r>
-              <w:t>Fac_song</w:t>
-            </w:r>
-            <w:proofErr w:type="spellEnd"/>
-            <w:r>
+            <w:r>
+              <w:t xml:space="preserve">Fac_song </w:t>
+            </w:r>
+          </w:p>
+        </w:tc>
+        <w:tc>
+          <w:tcPr>
+            <w:tcW w:w="2943" w:type="dxa"/>
+          </w:tcPr>
+          <w:p>
+            <w:pPr>
+              <w:jc w:val="both"/>
+              <w:rPr>
+                <w:lang w:val="en-US"/>
+              </w:rPr>
+            </w:pPr>
+            <w:r>
+              <w:rPr>
+                <w:lang w:val="en-US"/>
+              </w:rPr>
+              <w:t>album_key</w:t>
+            </w:r>
+            <w:r>
+              <w:rPr>
+                <w:lang w:val="en-US"/>
+              </w:rPr>
+              <w:t>,</w:t>
+            </w:r>
+            <w:r>
+              <w:rPr>
+                <w:lang w:val="en-US"/>
+              </w:rPr>
+              <w:t>track_key</w:t>
+            </w:r>
+            <w:r>
+              <w:rPr>
+                <w:lang w:val="en-US"/>
+              </w:rPr>
+              <w:t xml:space="preserve">, </w:t>
+            </w:r>
+            <w:r>
+              <w:rPr>
+                <w:lang w:val="en-US"/>
+              </w:rPr>
+              <w:t>genre_key,artists_key,</w:t>
+            </w:r>
+            <w:r>
+              <w:rPr>
+                <w:lang w:val="en-US"/>
+              </w:rPr>
               <w:t xml:space="preserve"> </w:t>
             </w:r>
+            <w:r>
+              <w:rPr>
+                <w:lang w:val="en-US"/>
+              </w:rPr>
+              <w:t>explicit, energy, danceability, popularity, duration_ms</w:t>
+            </w:r>
+            <w:r>
+              <w:rPr>
+                <w:lang w:val="en-US"/>
+              </w:rPr>
+              <w:t>,</w:t>
+            </w:r>
+            <w:r>
+              <w:rPr>
+                <w:lang w:val="en-US"/>
+              </w:rPr>
+              <w:t xml:space="preserve"> genre_weight; UK (track_key, genre_key, artist_key)</w:t>
+            </w:r>
           </w:p>
         </w:tc>
         <w:tc>
@@ -6706,166 +5777,11 @@
                 <w:lang w:val="en-US"/>
               </w:rPr>
             </w:pPr>
-            <w:proofErr w:type="spellStart"/>
             <w:r>
               <w:rPr>
                 <w:lang w:val="en-US"/>
               </w:rPr>
-              <w:t>album_key</w:t>
-            </w:r>
-            <w:r>
-              <w:rPr>
-                <w:lang w:val="en-US"/>
-              </w:rPr>
-              <w:t>,</w:t>
-            </w:r>
-            <w:r>
-              <w:rPr>
-                <w:lang w:val="en-US"/>
-              </w:rPr>
-              <w:t>track_key</w:t>
-            </w:r>
-            <w:proofErr w:type="spellEnd"/>
-            <w:r>
-              <w:rPr>
-                <w:lang w:val="en-US"/>
-              </w:rPr>
-              <w:t xml:space="preserve">, </w:t>
-            </w:r>
-            <w:proofErr w:type="spellStart"/>
-            <w:r>
-              <w:rPr>
-                <w:lang w:val="en-US"/>
-              </w:rPr>
-              <w:t>genre_key,artists_key</w:t>
-            </w:r>
-            <w:proofErr w:type="spellEnd"/>
-            <w:r>
-              <w:rPr>
-                <w:lang w:val="en-US"/>
-              </w:rPr>
-              <w:t>,</w:t>
-            </w:r>
-            <w:r>
-              <w:rPr>
-                <w:lang w:val="en-US"/>
-              </w:rPr>
-              <w:t xml:space="preserve"> </w:t>
-            </w:r>
-            <w:r>
-              <w:rPr>
-                <w:lang w:val="en-US"/>
-              </w:rPr>
-              <w:t xml:space="preserve">explicit, energy, danceability, popularity, </w:t>
-            </w:r>
-            <w:proofErr w:type="spellStart"/>
-            <w:r>
-              <w:rPr>
-                <w:lang w:val="en-US"/>
-              </w:rPr>
-              <w:t>duration_ms</w:t>
-            </w:r>
-            <w:proofErr w:type="spellEnd"/>
-            <w:r>
-              <w:rPr>
-                <w:lang w:val="en-US"/>
-              </w:rPr>
-              <w:t>,</w:t>
-            </w:r>
-            <w:r>
-              <w:rPr>
-                <w:lang w:val="en-US"/>
-              </w:rPr>
-              <w:t xml:space="preserve"> </w:t>
-            </w:r>
-            <w:proofErr w:type="spellStart"/>
-            <w:r>
-              <w:rPr>
-                <w:lang w:val="en-US"/>
-              </w:rPr>
-              <w:t>genre_weight</w:t>
-            </w:r>
-            <w:proofErr w:type="spellEnd"/>
-            <w:r>
-              <w:rPr>
-                <w:lang w:val="en-US"/>
-              </w:rPr>
-              <w:t>; UK (</w:t>
-            </w:r>
-            <w:proofErr w:type="spellStart"/>
-            <w:r>
-              <w:rPr>
-                <w:lang w:val="en-US"/>
-              </w:rPr>
-              <w:t>track_key</w:t>
-            </w:r>
-            <w:proofErr w:type="spellEnd"/>
-            <w:r>
-              <w:rPr>
-                <w:lang w:val="en-US"/>
-              </w:rPr>
-              <w:t xml:space="preserve">, </w:t>
-            </w:r>
-            <w:proofErr w:type="spellStart"/>
-            <w:r>
-              <w:rPr>
-                <w:lang w:val="en-US"/>
-              </w:rPr>
-              <w:t>genre_key</w:t>
-            </w:r>
-            <w:proofErr w:type="spellEnd"/>
-            <w:r>
-              <w:rPr>
-                <w:lang w:val="en-US"/>
-              </w:rPr>
-              <w:t xml:space="preserve">, </w:t>
-            </w:r>
-            <w:proofErr w:type="spellStart"/>
-            <w:r>
-              <w:rPr>
-                <w:lang w:val="en-US"/>
-              </w:rPr>
-              <w:t>artist_key</w:t>
-            </w:r>
-            <w:proofErr w:type="spellEnd"/>
-            <w:r>
-              <w:rPr>
-                <w:lang w:val="en-US"/>
-              </w:rPr>
-              <w:t>)</w:t>
-            </w:r>
-          </w:p>
-        </w:tc>
-        <w:tc>
-          <w:tcPr>
-            <w:tcW w:w="2943" w:type="dxa"/>
-          </w:tcPr>
-          <w:p>
-            <w:pPr>
-              <w:jc w:val="both"/>
-              <w:rPr>
-                <w:lang w:val="en-US"/>
-              </w:rPr>
-            </w:pPr>
-            <w:r>
-              <w:rPr>
-                <w:lang w:val="en-US"/>
-              </w:rPr>
-              <w:t xml:space="preserve">Son las </w:t>
-            </w:r>
-            <w:proofErr w:type="spellStart"/>
-            <w:r>
-              <w:rPr>
-                <w:lang w:val="en-US"/>
-              </w:rPr>
-              <w:t>llaver</w:t>
-            </w:r>
-            <w:proofErr w:type="spellEnd"/>
-            <w:r>
-              <w:rPr>
-                <w:lang w:val="en-US"/>
-              </w:rPr>
-              <w:t xml:space="preserve"> </w:t>
+              <w:t xml:space="preserve">Son las llaver </w:t>
             </w:r>
           </w:p>
         </w:tc>
@@ -6979,11 +5895,9 @@
             <w:pPr>
               <w:jc w:val="both"/>
             </w:pPr>
-            <w:proofErr w:type="spellStart"/>
             <w:r>
               <w:t>dim_year</w:t>
             </w:r>
-            <w:proofErr w:type="spellEnd"/>
             <w:r>
               <w:t xml:space="preserve"> </w:t>
             </w:r>
@@ -6997,21 +5911,8 @@
             <w:pPr>
               <w:jc w:val="both"/>
             </w:pPr>
-            <w:proofErr w:type="spellStart"/>
-            <w:r>
-              <w:t>year_key</w:t>
-            </w:r>
-            <w:proofErr w:type="spellEnd"/>
-            <w:r>
-              <w:t xml:space="preserve">, </w:t>
-            </w:r>
-            <w:proofErr w:type="spellStart"/>
-            <w:r>
-              <w:t>year</w:t>
-            </w:r>
-            <w:proofErr w:type="spellEnd"/>
-            <w:r>
-              <w:t xml:space="preserve"> </w:t>
+            <w:r>
+              <w:t xml:space="preserve">year_key, year </w:t>
             </w:r>
           </w:p>
         </w:tc>
@@ -7035,14 +5936,12 @@
             <w:pPr>
               <w:jc w:val="both"/>
             </w:pPr>
-            <w:proofErr w:type="spellStart"/>
             <w:r>
               <w:t>dim_</w:t>
             </w:r>
             <w:r>
               <w:t>category</w:t>
             </w:r>
-            <w:proofErr w:type="spellEnd"/>
           </w:p>
         </w:tc>
         <w:tc>
@@ -7056,19 +5955,11 @@
                 <w:lang w:val="en-US"/>
               </w:rPr>
             </w:pPr>
-            <w:proofErr w:type="spellStart"/>
             <w:r>
               <w:rPr>
                 <w:lang w:val="en-US"/>
               </w:rPr>
-              <w:t>Category_key</w:t>
-            </w:r>
-            <w:proofErr w:type="spellEnd"/>
-            <w:r>
-              <w:rPr>
-                <w:lang w:val="en-US"/>
-              </w:rPr>
-              <w:t>, category</w:t>
+              <w:t>Category_key, category</w:t>
             </w:r>
           </w:p>
         </w:tc>
@@ -7081,15 +5972,7 @@
               <w:jc w:val="both"/>
             </w:pPr>
             <w:r>
-              <w:t xml:space="preserve">Estas son las </w:t>
-            </w:r>
-            <w:proofErr w:type="spellStart"/>
-            <w:r>
-              <w:t>las</w:t>
-            </w:r>
-            <w:proofErr w:type="spellEnd"/>
-            <w:r>
-              <w:t xml:space="preserve"> </w:t>
+              <w:t xml:space="preserve">Estas son las las </w:t>
             </w:r>
             <w:r>
               <w:t>características que pertenecen a la canción</w:t>
@@ -7106,14 +5989,12 @@
             <w:pPr>
               <w:jc w:val="both"/>
             </w:pPr>
-            <w:proofErr w:type="spellStart"/>
             <w:r>
               <w:t>dim_</w:t>
             </w:r>
             <w:r>
               <w:t>artists</w:t>
             </w:r>
-            <w:proofErr w:type="spellEnd"/>
           </w:p>
         </w:tc>
         <w:tc>
@@ -7127,19 +6008,11 @@
                 <w:lang w:val="en-US"/>
               </w:rPr>
             </w:pPr>
-            <w:proofErr w:type="spellStart"/>
             <w:r>
               <w:rPr>
                 <w:lang w:val="en-US"/>
               </w:rPr>
-              <w:t>Artist_key</w:t>
-            </w:r>
-            <w:proofErr w:type="spellEnd"/>
-            <w:r>
-              <w:rPr>
-                <w:lang w:val="en-US"/>
-              </w:rPr>
-              <w:t>, artists</w:t>
+              <w:t>Artist_key, artists</w:t>
             </w:r>
           </w:p>
         </w:tc>
@@ -7166,11 +6039,9 @@
             <w:pPr>
               <w:jc w:val="both"/>
             </w:pPr>
-            <w:proofErr w:type="spellStart"/>
             <w:r>
               <w:t>nominee</w:t>
             </w:r>
-            <w:proofErr w:type="spellEnd"/>
           </w:p>
         </w:tc>
         <w:tc>
@@ -7184,19 +6055,11 @@
                 <w:lang w:val="en-US"/>
               </w:rPr>
             </w:pPr>
-            <w:proofErr w:type="spellStart"/>
             <w:r>
               <w:rPr>
                 <w:lang w:val="en-US"/>
               </w:rPr>
-              <w:t>Nominee_key</w:t>
-            </w:r>
-            <w:proofErr w:type="spellEnd"/>
-            <w:r>
-              <w:rPr>
-                <w:lang w:val="en-US"/>
-              </w:rPr>
-              <w:t>, nominee</w:t>
+              <w:t>Nominee_key, nominee</w:t>
             </w:r>
           </w:p>
         </w:tc>
@@ -7240,13 +6103,8 @@
             <w:pPr>
               <w:jc w:val="both"/>
             </w:pPr>
-            <w:proofErr w:type="spellStart"/>
-            <w:r>
-              <w:t>Fact</w:t>
-            </w:r>
-            <w:proofErr w:type="spellEnd"/>
-            <w:r>
-              <w:t xml:space="preserve"> table</w:t>
+            <w:r>
+              <w:t>Fact table</w:t>
             </w:r>
           </w:p>
         </w:tc>
@@ -7286,11 +6144,9 @@
             <w:pPr>
               <w:jc w:val="both"/>
             </w:pPr>
-            <w:proofErr w:type="spellStart"/>
             <w:r>
               <w:t>Fac_winner_grammy</w:t>
             </w:r>
-            <w:proofErr w:type="spellEnd"/>
           </w:p>
         </w:tc>
         <w:tc>
@@ -7304,129 +6160,55 @@
                 <w:lang w:val="en-US"/>
               </w:rPr>
             </w:pPr>
-            <w:proofErr w:type="spellStart"/>
             <w:r>
               <w:rPr>
                 <w:lang w:val="en-US"/>
               </w:rPr>
-              <w:t>Id_winner</w:t>
-            </w:r>
-            <w:proofErr w:type="spellEnd"/>
+              <w:t>Id_winner, year_key,</w:t>
+            </w:r>
             <w:r>
               <w:rPr>
                 <w:lang w:val="en-US"/>
               </w:rPr>
+              <w:t xml:space="preserve"> category_key, artists_key,nominee_key</w:t>
+            </w:r>
+            <w:r>
+              <w:rPr>
+                <w:lang w:val="en-US"/>
+              </w:rPr>
+              <w:t xml:space="preserve"> </w:t>
+            </w:r>
+            <w:r>
+              <w:rPr>
+                <w:lang w:val="en-US"/>
+              </w:rPr>
               <w:t xml:space="preserve">, </w:t>
             </w:r>
-            <w:proofErr w:type="spellStart"/>
             <w:r>
               <w:rPr>
                 <w:lang w:val="en-US"/>
               </w:rPr>
-              <w:t>year_key</w:t>
-            </w:r>
-            <w:proofErr w:type="spellEnd"/>
+              <w:lastRenderedPageBreak/>
+              <w:t>track_key[</w:t>
+            </w:r>
             <w:r>
               <w:rPr>
                 <w:lang w:val="en-US"/>
               </w:rPr>
-              <w:t>,</w:t>
+              <w:t>-1 si no hay match</w:t>
             </w:r>
             <w:r>
               <w:rPr>
                 <w:lang w:val="en-US"/>
               </w:rPr>
-              <w:t xml:space="preserve"> </w:t>
-            </w:r>
-            <w:proofErr w:type="spellStart"/>
+              <w:t>]</w:t>
+            </w:r>
             <w:r>
               <w:rPr>
                 <w:lang w:val="en-US"/>
               </w:rPr>
-              <w:t>category_key</w:t>
-            </w:r>
-            <w:proofErr w:type="spellEnd"/>
-            <w:r>
-              <w:rPr>
-                <w:lang w:val="en-US"/>
-              </w:rPr>
-              <w:t xml:space="preserve">, </w:t>
-            </w:r>
-            <w:proofErr w:type="spellStart"/>
-            <w:r>
-              <w:rPr>
-                <w:lang w:val="en-US"/>
-              </w:rPr>
-              <w:t>artists_key,nominee_key</w:t>
-            </w:r>
-            <w:proofErr w:type="spellEnd"/>
-            <w:r>
-              <w:rPr>
-                <w:lang w:val="en-US"/>
-              </w:rPr>
-              <w:t xml:space="preserve"> </w:t>
-            </w:r>
-            <w:r>
-              <w:rPr>
-                <w:lang w:val="en-US"/>
-              </w:rPr>
-              <w:t xml:space="preserve">, </w:t>
-            </w:r>
-            <w:proofErr w:type="spellStart"/>
-            <w:r>
-              <w:rPr>
-                <w:lang w:val="en-US"/>
-              </w:rPr>
-              <w:lastRenderedPageBreak/>
-              <w:t>track_key</w:t>
-            </w:r>
-            <w:proofErr w:type="spellEnd"/>
-            <w:r>
-              <w:rPr>
-                <w:lang w:val="en-US"/>
-              </w:rPr>
-              <w:t>[</w:t>
-            </w:r>
-            <w:r>
-              <w:rPr>
-                <w:lang w:val="en-US"/>
-              </w:rPr>
-              <w:t xml:space="preserve">-1 </w:t>
-            </w:r>
-            <w:proofErr w:type="spellStart"/>
-            <w:r>
-              <w:rPr>
-                <w:lang w:val="en-US"/>
-              </w:rPr>
-              <w:t>si</w:t>
-            </w:r>
-            <w:proofErr w:type="spellEnd"/>
-            <w:r>
-              <w:rPr>
-                <w:lang w:val="en-US"/>
-              </w:rPr>
-              <w:t xml:space="preserve"> no hay match</w:t>
-            </w:r>
-            <w:r>
-              <w:rPr>
-                <w:lang w:val="en-US"/>
-              </w:rPr>
-              <w:t>]</w:t>
-            </w:r>
-            <w:r>
-              <w:rPr>
-                <w:lang w:val="en-US"/>
-              </w:rPr>
-              <w:t>,</w:t>
-            </w:r>
-            <w:proofErr w:type="spellStart"/>
-            <w:r>
-              <w:rPr>
-                <w:lang w:val="en-US"/>
-              </w:rPr>
-              <w:t>win_count</w:t>
-            </w:r>
-            <w:proofErr w:type="spellEnd"/>
+              <w:t>,win_count</w:t>
+            </w:r>
           </w:p>
         </w:tc>
         <w:tc>
@@ -7477,6 +6259,7 @@
       </w:pPr>
       <w:r>
         <w:rPr>
+          <w:noProof/>
           <w:lang w:val="en-US"/>
         </w:rPr>
         <w:drawing>
@@ -7504,6 +6287,62 @@
                     <a:xfrm>
                       <a:off x="0" y="0"/>
                       <a:ext cx="5612130" cy="1984375"/>
+                    </a:xfrm>
+                    <a:prstGeom prst="rect">
+                      <a:avLst/>
+                    </a:prstGeom>
+                  </pic:spPr>
+                </pic:pic>
+              </a:graphicData>
+            </a:graphic>
+          </wp:inline>
+        </w:drawing>
+      </w:r>
+    </w:p>
+    <w:p>
+      <w:pPr>
+        <w:jc w:val="both"/>
+        <w:rPr>
+          <w:lang w:val="en-US"/>
+        </w:rPr>
+      </w:pPr>
+    </w:p>
+    <w:p>
+      <w:pPr>
+        <w:jc w:val="both"/>
+        <w:rPr>
+          <w:lang w:val="en-US"/>
+        </w:rPr>
+      </w:pPr>
+      <w:r>
+        <w:rPr>
+          <w:lang w:val="en-US"/>
+        </w:rPr>
+        <w:drawing>
+          <wp:inline distT="0" distB="0" distL="0" distR="0" wp14:anchorId="640143BD" wp14:editId="6A613B63">
+            <wp:extent cx="5612130" cy="3142615"/>
+            <wp:effectExtent l="0" t="0" r="7620" b="635"/>
+            <wp:docPr id="1450773317" name="Imagen 1"/>
+            <wp:cNvGraphicFramePr>
+              <a:graphicFrameLocks xmlns:a="http://schemas.openxmlformats.org/drawingml/2006/main" noChangeAspect="1"/>
+            </wp:cNvGraphicFramePr>
+            <a:graphic xmlns:a="http://schemas.openxmlformats.org/drawingml/2006/main">
+              <a:graphicData uri="http://schemas.openxmlformats.org/drawingml/2006/picture">
+                <pic:pic xmlns:pic="http://schemas.openxmlformats.org/drawingml/2006/picture">
+                  <pic:nvPicPr>
+                    <pic:cNvPr id="1450773317" name=""/>
+                    <pic:cNvPicPr/>
+                  </pic:nvPicPr>
+                  <pic:blipFill>
+                    <a:blip r:embed="rId7"/>
+                    <a:stretch>
+                      <a:fillRect/>
+                    </a:stretch>
+                  </pic:blipFill>
+                  <pic:spPr>
+                    <a:xfrm>
+                      <a:off x="0" y="0"/>
+                      <a:ext cx="5612130" cy="3142615"/>
                     </a:xfrm>
                     <a:prstGeom prst="rect">
                       <a:avLst/>
@@ -8225,6 +7064,7 @@
   <w:style w:type="character" w:default="1" w:styleId="Fuentedeprrafopredeter">
     <w:name w:val="Default Paragraph Font"/>
     <w:uiPriority w:val="1"/>
+    <w:semiHidden/>
     <w:unhideWhenUsed/>
   </w:style>
   <w:style w:type="table" w:default="1" w:styleId="Tablanormal">

</xml_diff>